<commit_message>
v2: inclusión de la red de pedagogía
</commit_message>
<xml_diff>
--- a/CONVOCATORIA DEVNET.docx
+++ b/CONVOCATORIA DEVNET.docx
@@ -87,7 +87,6 @@
           <w:lang w:eastAsia="es-ES"/>
         </w:rPr>
       </w:pPr>
-      <w:proofErr w:type="spellStart"/>
       <w:r>
         <w:rPr>
           <w:rFonts w:asciiTheme="majorHAnsi" w:eastAsia="Times New Roman" w:hAnsiTheme="majorHAnsi" w:cstheme="majorHAnsi"/>
@@ -98,7 +97,6 @@
         </w:rPr>
         <w:t>DevNet</w:t>
       </w:r>
-      <w:proofErr w:type="spellEnd"/>
       <w:r>
         <w:rPr>
           <w:rFonts w:asciiTheme="majorHAnsi" w:eastAsia="Times New Roman" w:hAnsiTheme="majorHAnsi" w:cstheme="majorHAnsi"/>
@@ -316,6 +314,86 @@
               <w:rPr>
                 <w:rFonts w:asciiTheme="majorHAnsi" w:hAnsiTheme="majorHAnsi" w:cstheme="majorHAnsi"/>
                 <w:color w:val="000000" w:themeColor="text1"/>
+              </w:rPr>
+            </w:pPr>
+            <w:r>
+              <w:rPr>
+                <w:rFonts w:asciiTheme="majorHAnsi" w:hAnsiTheme="majorHAnsi" w:cstheme="majorHAnsi"/>
+                <w:b/>
+                <w:bCs/>
+                <w:color w:val="000000" w:themeColor="text1"/>
+              </w:rPr>
+              <w:t>INSTITUCIONAL DE PEDAGOGÍA </w:t>
+            </w:r>
+          </w:p>
+        </w:tc>
+        <w:tc>
+          <w:tcPr>
+            <w:tcW w:w="0" w:type="auto"/>
+            <w:vAlign w:val="center"/>
+          </w:tcPr>
+          <w:p>
+            <w:pPr>
+              <w:spacing w:line="240" w:lineRule="auto"/>
+              <w:jc w:val="center"/>
+              <w:rPr>
+                <w:rFonts w:asciiTheme="majorHAnsi" w:hAnsiTheme="majorHAnsi" w:cstheme="majorHAnsi"/>
+                <w:color w:val="000000" w:themeColor="text1"/>
+                <w:lang w:bidi="es-ES"/>
+              </w:rPr>
+            </w:pPr>
+            <w:r>
+              <w:rPr>
+                <w:rFonts w:asciiTheme="majorHAnsi" w:hAnsiTheme="majorHAnsi" w:cstheme="majorHAnsi"/>
+                <w:color w:val="000000" w:themeColor="text1"/>
+                <w:lang w:bidi="es-ES"/>
+              </w:rPr>
+              <w:t>TODAS</w:t>
+            </w:r>
+          </w:p>
+        </w:tc>
+        <w:tc>
+          <w:tcPr>
+            <w:tcW w:w="4627" w:type="dxa"/>
+            <w:vAlign w:val="center"/>
+          </w:tcPr>
+          <w:p>
+            <w:pPr>
+              <w:jc w:val="both"/>
+              <w:rPr>
+                <w:rFonts w:asciiTheme="majorHAnsi" w:hAnsiTheme="majorHAnsi" w:cstheme="majorHAnsi"/>
+                <w:color w:val="000000" w:themeColor="text1"/>
+                <w:lang w:bidi="es-ES"/>
+              </w:rPr>
+            </w:pPr>
+            <w:r>
+              <w:rPr>
+                <w:rFonts w:asciiTheme="majorHAnsi" w:hAnsiTheme="majorHAnsi" w:cstheme="majorHAnsi"/>
+                <w:b/>
+                <w:bCs/>
+                <w:color w:val="000000" w:themeColor="text1"/>
+                <w:lang w:bidi="es-ES"/>
+              </w:rPr>
+              <w:t>Implementar soluciones tecnológicas en la formación</w:t>
+            </w:r>
+          </w:p>
+        </w:tc>
+      </w:tr>
+      <w:tr>
+        <w:trPr>
+          <w:trHeight w:val="2984"/>
+        </w:trPr>
+        <w:tc>
+          <w:tcPr>
+            <w:tcW w:w="0" w:type="auto"/>
+            <w:vAlign w:val="center"/>
+          </w:tcPr>
+          <w:p>
+            <w:pPr>
+              <w:jc w:val="center"/>
+              <w:rPr>
+                <w:rFonts w:asciiTheme="majorHAnsi" w:hAnsiTheme="majorHAnsi" w:cstheme="majorHAnsi"/>
+                <w:color w:val="000000" w:themeColor="text1"/>
                 <w:lang w:bidi="es-ES"/>
               </w:rPr>
             </w:pPr>
@@ -649,7 +727,17 @@
           <w:sz w:val="22"/>
           <w:szCs w:val="22"/>
         </w:rPr>
-        <w:t>El Plan de Gobierno 2022–2026 “COLOMBIA POTENCIA MUNDIAL DE LA VIDA” promueve el uso estratégico de la tecnología como motor para la transformación digital del país, con el fin de impulsar la competitividad, modernizar la infraestructura tecnológica y cerrar brechas en conectividad y acceso al conocimiento.</w:t>
+        <w:t xml:space="preserve">El Plan de Gobierno 2022–2026 “COLOMBIA POTENCIA MUNDIAL DE LA VIDA” promueve el uso estratégico de la tecnología como motor para la transformación digital del país, con el fin de </w:t>
+      </w:r>
+      <w:r>
+        <w:rPr>
+          <w:rFonts w:asciiTheme="majorHAnsi" w:hAnsiTheme="majorHAnsi" w:cstheme="majorHAnsi"/>
+          <w:color w:val="000000" w:themeColor="text1"/>
+          <w:sz w:val="22"/>
+          <w:szCs w:val="22"/>
+        </w:rPr>
+        <w:lastRenderedPageBreak/>
+        <w:t>impulsar la competitividad, modernizar la infraestructura tecnológica y cerrar brechas en conectividad y acceso al conocimiento.</w:t>
       </w:r>
     </w:p>
     <w:p>
@@ -691,9 +779,8 @@
           <w:sz w:val="22"/>
           <w:szCs w:val="22"/>
         </w:rPr>
-        <w:t xml:space="preserve">En este contexto, </w:t>
-      </w:r>
-      <w:proofErr w:type="spellStart"/>
+        <w:t>En este contexto, DevNet se presenta como una iniciativa clave que integra el desarrollo de software con el conocimiento en redes, permitiendo a los profesionales automatizar tareas, integrar sistemas, mejorar tiempos de respuesta ante incidentes y reducir la complejidad operativa en entornos de red híbridos (físicos y virtualizados)</w:t>
+      </w:r>
       <w:r>
         <w:rPr>
           <w:rFonts w:asciiTheme="majorHAnsi" w:hAnsiTheme="majorHAnsi" w:cstheme="majorHAnsi"/>
@@ -701,9 +788,8 @@
           <w:sz w:val="22"/>
           <w:szCs w:val="22"/>
         </w:rPr>
-        <w:t>DevNet</w:t>
-      </w:r>
-      <w:proofErr w:type="spellEnd"/>
+        <w:t xml:space="preserve">, avanzando así </w:t>
+      </w:r>
       <w:r>
         <w:rPr>
           <w:rFonts w:asciiTheme="majorHAnsi" w:hAnsiTheme="majorHAnsi" w:cstheme="majorHAnsi"/>
@@ -711,8 +797,19 @@
           <w:sz w:val="22"/>
           <w:szCs w:val="22"/>
         </w:rPr>
-        <w:t xml:space="preserve"> se presenta como una iniciativa clave que integra el desarrollo de software con el conocimiento en redes, permitiendo a los profesionales automatizar tareas, integrar sistemas, mejorar tiempos de respuesta ante incidentes y reducir la complejidad operativa en entornos de red híbridos (físicos y virtualizados)</w:t>
-      </w:r>
+        <w:t>hacia modelos de operación más ágiles, escalables y sostenibles en sectores como educación, salud, agricultura, industria y administración pública.</w:t>
+      </w:r>
+    </w:p>
+    <w:p>
+      <w:pPr>
+        <w:pStyle w:val="NormalWeb"/>
+        <w:jc w:val="both"/>
+        <w:rPr>
+          <w:rFonts w:asciiTheme="majorHAnsi" w:hAnsiTheme="majorHAnsi" w:cstheme="majorHAnsi"/>
+          <w:b/>
+          <w:bCs/>
+        </w:rPr>
+      </w:pPr>
       <w:r>
         <w:rPr>
           <w:rFonts w:asciiTheme="majorHAnsi" w:hAnsiTheme="majorHAnsi" w:cstheme="majorHAnsi"/>
@@ -720,7 +817,7 @@
           <w:sz w:val="22"/>
           <w:szCs w:val="22"/>
         </w:rPr>
-        <w:t xml:space="preserve">, avanzando así </w:t>
+        <w:t>Por lo anterior,</w:t>
       </w:r>
       <w:r>
         <w:rPr>
@@ -729,7 +826,7 @@
           <w:sz w:val="22"/>
           <w:szCs w:val="22"/>
         </w:rPr>
-        <w:t xml:space="preserve">hacia modelos de </w:t>
+        <w:t xml:space="preserve"> </w:t>
       </w:r>
       <w:r>
         <w:rPr>
@@ -738,141 +835,90 @@
           <w:sz w:val="22"/>
           <w:szCs w:val="22"/>
         </w:rPr>
-        <w:lastRenderedPageBreak/>
-        <w:t>operación más ágiles, escalables y sostenibles en sectores como educación, salud, agricultura, industria y administración pública.</w:t>
-      </w:r>
-    </w:p>
-    <w:p>
-      <w:pPr>
-        <w:pStyle w:val="NormalWeb"/>
-        <w:jc w:val="both"/>
+        <w:t>l</w:t>
+      </w:r>
+      <w:r>
+        <w:rPr>
+          <w:rFonts w:asciiTheme="majorHAnsi" w:hAnsiTheme="majorHAnsi" w:cstheme="majorHAnsi"/>
+          <w:color w:val="000000" w:themeColor="text1"/>
+          <w:sz w:val="22"/>
+          <w:szCs w:val="22"/>
+        </w:rPr>
+        <w:t>a Dirección de Formación Profesional (DFP)</w:t>
+      </w:r>
+      <w:r>
+        <w:rPr>
+          <w:rStyle w:val="Refdenotaalpie"/>
+          <w:rFonts w:asciiTheme="majorHAnsi" w:hAnsiTheme="majorHAnsi" w:cstheme="majorHAnsi"/>
+          <w:color w:val="000000" w:themeColor="text1"/>
+          <w:sz w:val="22"/>
+          <w:szCs w:val="22"/>
+        </w:rPr>
+        <w:t xml:space="preserve"> </w:t>
+      </w:r>
+      <w:r>
+        <w:rPr>
+          <w:rStyle w:val="Refdenotaalpie"/>
+          <w:rFonts w:asciiTheme="majorHAnsi" w:hAnsiTheme="majorHAnsi" w:cstheme="majorHAnsi"/>
+          <w:color w:val="000000" w:themeColor="text1"/>
+          <w:sz w:val="22"/>
+          <w:szCs w:val="22"/>
+        </w:rPr>
+        <w:footnoteReference w:id="1"/>
+      </w:r>
+      <w:r>
+        <w:rPr>
+          <w:rFonts w:asciiTheme="majorHAnsi" w:hAnsiTheme="majorHAnsi" w:cstheme="majorHAnsi"/>
+          <w:color w:val="000000" w:themeColor="text1"/>
+          <w:sz w:val="22"/>
+          <w:szCs w:val="22"/>
+        </w:rPr>
+        <w:t xml:space="preserve"> en desarrollo de sus objetivos y propósitos, dirigidos a la permanente actualización y desarrollo de competencias que implican un avance en las capacidades y habilidades técnicas de los instructores en la institución, abre </w:t>
+      </w:r>
+      <w:r>
+        <w:rPr>
+          <w:rFonts w:asciiTheme="majorHAnsi" w:hAnsiTheme="majorHAnsi" w:cstheme="majorHAnsi"/>
+          <w:color w:val="000000" w:themeColor="text1"/>
+          <w:sz w:val="22"/>
+          <w:szCs w:val="22"/>
+        </w:rPr>
+        <w:t>la</w:t>
+      </w:r>
+      <w:r>
+        <w:rPr>
+          <w:rFonts w:asciiTheme="majorHAnsi" w:hAnsiTheme="majorHAnsi" w:cstheme="majorHAnsi"/>
+          <w:color w:val="000000" w:themeColor="text1"/>
+          <w:sz w:val="22"/>
+          <w:szCs w:val="22"/>
+        </w:rPr>
+        <w:t xml:space="preserve"> convocatoria</w:t>
+      </w:r>
+      <w:r>
+        <w:rPr>
+          <w:rFonts w:asciiTheme="majorHAnsi" w:hAnsiTheme="majorHAnsi" w:cstheme="majorHAnsi"/>
+          <w:color w:val="000000" w:themeColor="text1"/>
+          <w:sz w:val="22"/>
+          <w:szCs w:val="22"/>
+        </w:rPr>
+        <w:t xml:space="preserve"> </w:t>
+      </w:r>
+      <w:r>
         <w:rPr>
           <w:rFonts w:asciiTheme="majorHAnsi" w:hAnsiTheme="majorHAnsi" w:cstheme="majorHAnsi"/>
           <w:b/>
           <w:bCs/>
         </w:rPr>
-      </w:pPr>
-      <w:r>
-        <w:rPr>
-          <w:rFonts w:asciiTheme="majorHAnsi" w:hAnsiTheme="majorHAnsi" w:cstheme="majorHAnsi"/>
-          <w:color w:val="000000" w:themeColor="text1"/>
-          <w:sz w:val="22"/>
-          <w:szCs w:val="22"/>
-        </w:rPr>
-        <w:t>Por lo anterior,</w:t>
-      </w:r>
-      <w:r>
-        <w:rPr>
-          <w:rFonts w:asciiTheme="majorHAnsi" w:hAnsiTheme="majorHAnsi" w:cstheme="majorHAnsi"/>
-          <w:color w:val="000000" w:themeColor="text1"/>
-          <w:sz w:val="22"/>
-          <w:szCs w:val="22"/>
-        </w:rPr>
-        <w:t xml:space="preserve"> </w:t>
-      </w:r>
-      <w:r>
-        <w:rPr>
-          <w:rFonts w:asciiTheme="majorHAnsi" w:hAnsiTheme="majorHAnsi" w:cstheme="majorHAnsi"/>
-          <w:color w:val="000000" w:themeColor="text1"/>
-          <w:sz w:val="22"/>
-          <w:szCs w:val="22"/>
-        </w:rPr>
-        <w:t>l</w:t>
-      </w:r>
-      <w:r>
-        <w:rPr>
-          <w:rFonts w:asciiTheme="majorHAnsi" w:hAnsiTheme="majorHAnsi" w:cstheme="majorHAnsi"/>
-          <w:color w:val="000000" w:themeColor="text1"/>
-          <w:sz w:val="22"/>
-          <w:szCs w:val="22"/>
-        </w:rPr>
-        <w:t>a Dirección de Formación Profesional (DFP)</w:t>
-      </w:r>
-      <w:r>
-        <w:rPr>
-          <w:rStyle w:val="Refdenotaalpie"/>
-          <w:rFonts w:asciiTheme="majorHAnsi" w:hAnsiTheme="majorHAnsi" w:cstheme="majorHAnsi"/>
-          <w:color w:val="000000" w:themeColor="text1"/>
-          <w:sz w:val="22"/>
-          <w:szCs w:val="22"/>
-        </w:rPr>
-        <w:t xml:space="preserve"> </w:t>
-      </w:r>
-      <w:r>
-        <w:rPr>
-          <w:rStyle w:val="Refdenotaalpie"/>
-          <w:rFonts w:asciiTheme="majorHAnsi" w:hAnsiTheme="majorHAnsi" w:cstheme="majorHAnsi"/>
-          <w:color w:val="000000" w:themeColor="text1"/>
-          <w:sz w:val="22"/>
-          <w:szCs w:val="22"/>
-        </w:rPr>
-        <w:footnoteReference w:id="1"/>
-      </w:r>
-      <w:r>
-        <w:rPr>
-          <w:rFonts w:asciiTheme="majorHAnsi" w:hAnsiTheme="majorHAnsi" w:cstheme="majorHAnsi"/>
-          <w:color w:val="000000" w:themeColor="text1"/>
-          <w:sz w:val="22"/>
-          <w:szCs w:val="22"/>
-        </w:rPr>
-        <w:t xml:space="preserve"> en desarrollo de sus objetivos y propósitos, dirigidos a la permanente actualización y desarrollo de competencias que implican un avance en las capacidades y habilidades técnicas de los instructores en la institución, abre </w:t>
-      </w:r>
-      <w:r>
-        <w:rPr>
-          <w:rFonts w:asciiTheme="majorHAnsi" w:hAnsiTheme="majorHAnsi" w:cstheme="majorHAnsi"/>
-          <w:color w:val="000000" w:themeColor="text1"/>
-          <w:sz w:val="22"/>
-          <w:szCs w:val="22"/>
-        </w:rPr>
-        <w:t>la</w:t>
-      </w:r>
-      <w:r>
-        <w:rPr>
-          <w:rFonts w:asciiTheme="majorHAnsi" w:hAnsiTheme="majorHAnsi" w:cstheme="majorHAnsi"/>
-          <w:color w:val="000000" w:themeColor="text1"/>
-          <w:sz w:val="22"/>
-          <w:szCs w:val="22"/>
-        </w:rPr>
-        <w:t xml:space="preserve"> convocatoria</w:t>
-      </w:r>
-      <w:r>
-        <w:rPr>
-          <w:rFonts w:asciiTheme="majorHAnsi" w:hAnsiTheme="majorHAnsi" w:cstheme="majorHAnsi"/>
-          <w:color w:val="000000" w:themeColor="text1"/>
-          <w:sz w:val="22"/>
-          <w:szCs w:val="22"/>
-        </w:rPr>
-        <w:t xml:space="preserve"> </w:t>
+        <w:t>“</w:t>
       </w:r>
       <w:r>
         <w:rPr>
           <w:rFonts w:asciiTheme="majorHAnsi" w:hAnsiTheme="majorHAnsi" w:cstheme="majorHAnsi"/>
           <w:b/>
           <w:bCs/>
-        </w:rPr>
-        <w:t>“</w:t>
-      </w:r>
-      <w:proofErr w:type="spellStart"/>
-      <w:r>
-        <w:rPr>
-          <w:rFonts w:asciiTheme="majorHAnsi" w:hAnsiTheme="majorHAnsi" w:cstheme="majorHAnsi"/>
-          <w:b/>
-          <w:bCs/>
           <w:color w:val="000000" w:themeColor="text1"/>
           <w:lang w:eastAsia="es-ES"/>
         </w:rPr>
-        <w:t>DevNet</w:t>
-      </w:r>
-      <w:proofErr w:type="spellEnd"/>
-      <w:r>
-        <w:rPr>
-          <w:rFonts w:asciiTheme="majorHAnsi" w:hAnsiTheme="majorHAnsi" w:cstheme="majorHAnsi"/>
-          <w:b/>
-          <w:bCs/>
-          <w:color w:val="000000" w:themeColor="text1"/>
-          <w:lang w:eastAsia="es-ES"/>
-        </w:rPr>
-        <w:t>: Desarrollo de Software para la Automatización de Redes Nivel Básico</w:t>
+        <w:t>DevNet: Desarrollo de Software para la Automatización de Redes Nivel Básico</w:t>
       </w:r>
       <w:r>
         <w:rPr>
@@ -1616,6 +1662,7 @@
                 <w:bCs/>
                 <w:color w:val="000000" w:themeColor="text1"/>
               </w:rPr>
+              <w:lastRenderedPageBreak/>
               <w:t>Fecha Fin Fase Presencial</w:t>
             </w:r>
           </w:p>
@@ -1986,7 +2033,6 @@
                 <w:b/>
                 <w:color w:val="auto"/>
               </w:rPr>
-              <w:lastRenderedPageBreak/>
               <w:t>Fecha</w:t>
             </w:r>
           </w:p>
@@ -2352,20 +2398,8 @@
                 <w:sz w:val="18"/>
                 <w:szCs w:val="18"/>
               </w:rPr>
-              <w:t xml:space="preserve"> al curso </w:t>
-            </w:r>
-            <w:proofErr w:type="spellStart"/>
-            <w:r>
-              <w:rPr>
-                <w:rFonts w:eastAsiaTheme="minorEastAsia"/>
-                <w:bCs/>
-                <w:color w:val="000000" w:themeColor="text1"/>
-                <w:sz w:val="18"/>
-                <w:szCs w:val="18"/>
-              </w:rPr>
-              <w:t>DevNet</w:t>
-            </w:r>
-            <w:proofErr w:type="spellEnd"/>
+              <w:t xml:space="preserve"> al curso DevNet</w:t>
+            </w:r>
           </w:p>
           <w:p>
             <w:pPr>
@@ -2388,20 +2422,8 @@
                 <w:sz w:val="18"/>
                 <w:szCs w:val="18"/>
               </w:rPr>
-              <w:t xml:space="preserve">Módulo 2 Entorno de desarrolladores de </w:t>
-            </w:r>
-            <w:proofErr w:type="spellStart"/>
-            <w:r>
-              <w:rPr>
-                <w:rFonts w:eastAsiaTheme="minorEastAsia"/>
-                <w:bCs/>
-                <w:color w:val="000000" w:themeColor="text1"/>
-                <w:sz w:val="18"/>
-                <w:szCs w:val="18"/>
-              </w:rPr>
-              <w:t>DevNet</w:t>
-            </w:r>
-            <w:proofErr w:type="spellEnd"/>
+              <w:t>Módulo 2 Entorno de desarrolladores de DevNet</w:t>
+            </w:r>
           </w:p>
           <w:p>
             <w:pPr>
@@ -2450,42 +2472,8 @@
                 <w:sz w:val="18"/>
                 <w:szCs w:val="18"/>
               </w:rPr>
-              <w:t xml:space="preserve">1.2.2 </w:t>
-            </w:r>
-            <w:proofErr w:type="spellStart"/>
-            <w:r>
-              <w:rPr>
-                <w:rFonts w:eastAsiaTheme="minorEastAsia"/>
-                <w:bCs/>
-                <w:color w:val="000000" w:themeColor="text1"/>
-                <w:sz w:val="18"/>
-                <w:szCs w:val="18"/>
-              </w:rPr>
-              <w:t>Lab</w:t>
-            </w:r>
-            <w:proofErr w:type="spellEnd"/>
-            <w:r>
-              <w:rPr>
-                <w:rFonts w:eastAsiaTheme="minorEastAsia"/>
-                <w:bCs/>
-                <w:color w:val="000000" w:themeColor="text1"/>
-                <w:sz w:val="18"/>
-                <w:szCs w:val="18"/>
-              </w:rPr>
-              <w:t xml:space="preserve"> - Linux </w:t>
-            </w:r>
-            <w:proofErr w:type="spellStart"/>
-            <w:r>
-              <w:rPr>
-                <w:rFonts w:eastAsiaTheme="minorEastAsia"/>
-                <w:bCs/>
-                <w:color w:val="000000" w:themeColor="text1"/>
-                <w:sz w:val="18"/>
-                <w:szCs w:val="18"/>
-              </w:rPr>
-              <w:t>Review</w:t>
-            </w:r>
-            <w:proofErr w:type="spellEnd"/>
+              <w:t>1.2.2 Lab - Linux Review</w:t>
+            </w:r>
           </w:p>
         </w:tc>
       </w:tr>
@@ -3203,6 +3191,7 @@
                 <w:sz w:val="18"/>
                 <w:szCs w:val="18"/>
               </w:rPr>
+              <w:lastRenderedPageBreak/>
               <w:t xml:space="preserve"> </w:t>
             </w:r>
             <w:r>
@@ -3282,6 +3271,7 @@
                 <w:sz w:val="18"/>
                 <w:szCs w:val="18"/>
               </w:rPr>
+              <w:lastRenderedPageBreak/>
               <w:t xml:space="preserve">8:00 </w:t>
             </w:r>
             <w:r>
@@ -4862,73 +4852,7 @@
                 <w:sz w:val="18"/>
                 <w:szCs w:val="18"/>
               </w:rPr>
-              <w:t xml:space="preserve">7.0.3 </w:t>
-            </w:r>
-            <w:proofErr w:type="spellStart"/>
-            <w:r>
-              <w:rPr>
-                <w:rFonts w:eastAsiaTheme="minorEastAsia"/>
-                <w:bCs/>
-                <w:color w:val="000000" w:themeColor="text1"/>
-                <w:sz w:val="18"/>
-                <w:szCs w:val="18"/>
-              </w:rPr>
-              <w:t>Lab</w:t>
-            </w:r>
-            <w:proofErr w:type="spellEnd"/>
-            <w:r>
-              <w:rPr>
-                <w:rFonts w:eastAsiaTheme="minorEastAsia"/>
-                <w:bCs/>
-                <w:color w:val="000000" w:themeColor="text1"/>
-                <w:sz w:val="18"/>
-                <w:szCs w:val="18"/>
-              </w:rPr>
-              <w:t xml:space="preserve"> - </w:t>
-            </w:r>
-            <w:proofErr w:type="spellStart"/>
-            <w:r>
-              <w:rPr>
-                <w:rFonts w:eastAsiaTheme="minorEastAsia"/>
-                <w:bCs/>
-                <w:color w:val="000000" w:themeColor="text1"/>
-                <w:sz w:val="18"/>
-                <w:szCs w:val="18"/>
-              </w:rPr>
-              <w:t>Install</w:t>
-            </w:r>
-            <w:proofErr w:type="spellEnd"/>
-            <w:r>
-              <w:rPr>
-                <w:rFonts w:eastAsiaTheme="minorEastAsia"/>
-                <w:bCs/>
-                <w:color w:val="000000" w:themeColor="text1"/>
-                <w:sz w:val="18"/>
-                <w:szCs w:val="18"/>
-              </w:rPr>
-              <w:t xml:space="preserve"> </w:t>
-            </w:r>
-            <w:proofErr w:type="spellStart"/>
-            <w:r>
-              <w:rPr>
-                <w:rFonts w:eastAsiaTheme="minorEastAsia"/>
-                <w:bCs/>
-                <w:color w:val="000000" w:themeColor="text1"/>
-                <w:sz w:val="18"/>
-                <w:szCs w:val="18"/>
-              </w:rPr>
-              <w:t>the</w:t>
-            </w:r>
-            <w:proofErr w:type="spellEnd"/>
-            <w:r>
-              <w:rPr>
-                <w:rFonts w:eastAsiaTheme="minorEastAsia"/>
-                <w:bCs/>
-                <w:color w:val="000000" w:themeColor="text1"/>
-                <w:sz w:val="18"/>
-                <w:szCs w:val="18"/>
-              </w:rPr>
-              <w:t xml:space="preserve"> CSR1000v VM </w:t>
+              <w:t xml:space="preserve">7.0.3 Lab - Install the CSR1000v VM </w:t>
             </w:r>
           </w:p>
           <w:p>
@@ -5009,31 +4933,7 @@
                 <w:szCs w:val="18"/>
                 <w:lang w:val="en-US"/>
               </w:rPr>
-              <w:t xml:space="preserve">7.6.3 Lab - Automated Testing Using </w:t>
-            </w:r>
-            <w:proofErr w:type="spellStart"/>
-            <w:r>
-              <w:rPr>
-                <w:rFonts w:eastAsiaTheme="minorEastAsia"/>
-                <w:bCs/>
-                <w:color w:val="000000" w:themeColor="text1"/>
-                <w:sz w:val="18"/>
-                <w:szCs w:val="18"/>
-                <w:lang w:val="en-US"/>
-              </w:rPr>
-              <w:t>pyATS</w:t>
-            </w:r>
-            <w:proofErr w:type="spellEnd"/>
-            <w:r>
-              <w:rPr>
-                <w:rFonts w:eastAsiaTheme="minorEastAsia"/>
-                <w:bCs/>
-                <w:color w:val="000000" w:themeColor="text1"/>
-                <w:sz w:val="18"/>
-                <w:szCs w:val="18"/>
-                <w:lang w:val="en-US"/>
-              </w:rPr>
-              <w:t xml:space="preserve"> and Genie</w:t>
+              <w:t>7.6.3 Lab - Automated Testing Using pyATS and Genie</w:t>
             </w:r>
           </w:p>
           <w:p>
@@ -5581,42 +5481,8 @@
                 <w:sz w:val="18"/>
                 <w:szCs w:val="18"/>
               </w:rPr>
-              <w:t xml:space="preserve">8 Desarrollo y Plataformas de </w:t>
-            </w:r>
-            <w:proofErr w:type="spellStart"/>
-            <w:r>
-              <w:rPr>
-                <w:rFonts w:eastAsiaTheme="minorEastAsia"/>
-                <w:bCs/>
-                <w:color w:val="000000" w:themeColor="text1"/>
-                <w:sz w:val="18"/>
-                <w:szCs w:val="18"/>
-              </w:rPr>
-              <w:t>CiscoExternal</w:t>
-            </w:r>
-            <w:proofErr w:type="spellEnd"/>
-            <w:r>
-              <w:rPr>
-                <w:rFonts w:eastAsiaTheme="minorEastAsia"/>
-                <w:bCs/>
-                <w:color w:val="000000" w:themeColor="text1"/>
-                <w:sz w:val="18"/>
-                <w:szCs w:val="18"/>
-              </w:rPr>
-              <w:t xml:space="preserve"> </w:t>
-            </w:r>
-            <w:proofErr w:type="spellStart"/>
-            <w:r>
-              <w:rPr>
-                <w:rFonts w:eastAsiaTheme="minorEastAsia"/>
-                <w:bCs/>
-                <w:color w:val="000000" w:themeColor="text1"/>
-                <w:sz w:val="18"/>
-                <w:szCs w:val="18"/>
-              </w:rPr>
-              <w:t>tool</w:t>
-            </w:r>
-            <w:proofErr w:type="spellEnd"/>
+              <w:t>8 Desarrollo y Plataformas de CiscoExternal tool</w:t>
+            </w:r>
           </w:p>
           <w:p>
             <w:pPr>
@@ -6167,21 +6033,7 @@
         <w:rPr>
           <w:bCs/>
         </w:rPr>
-        <w:t xml:space="preserve">y Certificación en plataforma de Cisco </w:t>
-      </w:r>
-      <w:proofErr w:type="spellStart"/>
-      <w:r>
-        <w:rPr>
-          <w:bCs/>
-        </w:rPr>
-        <w:t>Netacad</w:t>
-      </w:r>
-      <w:proofErr w:type="spellEnd"/>
-      <w:r>
-        <w:rPr>
-          <w:bCs/>
-        </w:rPr>
-        <w:t xml:space="preserve"> </w:t>
+        <w:t xml:space="preserve">y Certificación en plataforma de Cisco Netacad </w:t>
       </w:r>
     </w:p>
     <w:p>
@@ -6948,7 +6800,6 @@
                 <w:color w:val="000000" w:themeColor="text1"/>
               </w:rPr>
             </w:pPr>
-            <w:proofErr w:type="spellStart"/>
             <w:r>
               <w:rPr>
                 <w:rFonts w:asciiTheme="majorHAnsi" w:hAnsiTheme="majorHAnsi" w:cstheme="majorHAnsi"/>
@@ -6957,7 +6808,6 @@
               </w:rPr>
               <w:t>Teams</w:t>
             </w:r>
-            <w:proofErr w:type="spellEnd"/>
             <w:r>
               <w:rPr>
                 <w:rFonts w:asciiTheme="majorHAnsi" w:hAnsiTheme="majorHAnsi" w:cstheme="majorHAnsi"/>
@@ -6974,23 +6824,13 @@
               </w:rPr>
               <w:t xml:space="preserve"> </w:t>
             </w:r>
-            <w:proofErr w:type="spellStart"/>
             <w:r>
               <w:rPr>
                 <w:rFonts w:asciiTheme="majorHAnsi" w:hAnsiTheme="majorHAnsi" w:cstheme="majorHAnsi"/>
                 <w:bCs/>
                 <w:color w:val="000000" w:themeColor="text1"/>
               </w:rPr>
-              <w:t>Webex</w:t>
-            </w:r>
-            <w:proofErr w:type="spellEnd"/>
-            <w:r>
-              <w:rPr>
-                <w:rFonts w:asciiTheme="majorHAnsi" w:hAnsiTheme="majorHAnsi" w:cstheme="majorHAnsi"/>
-                <w:bCs/>
-                <w:color w:val="000000" w:themeColor="text1"/>
-              </w:rPr>
-              <w:t xml:space="preserve"> </w:t>
+              <w:t xml:space="preserve">Webex </w:t>
             </w:r>
             <w:r>
               <w:rPr>
@@ -8050,14 +7890,7 @@
           <w:b/>
           <w:bCs/>
         </w:rPr>
-        <w:t xml:space="preserve">, </w:t>
-      </w:r>
-      <w:r>
-        <w:rPr>
-          <w:b/>
-          <w:bCs/>
-        </w:rPr>
-        <w:t xml:space="preserve">21730061         FUNDAMENTOS DE PROGRAMACIÓN  60 </w:t>
+        <w:t xml:space="preserve">, 21730061         FUNDAMENTOS DE PROGRAMACIÓN  60 </w:t>
       </w:r>
       <w:proofErr w:type="gramStart"/>
       <w:r>
@@ -8761,21 +8594,12 @@
         </w:rPr>
         <w:tab/>
       </w:r>
-      <w:proofErr w:type="spellStart"/>
-      <w:r>
-        <w:rPr>
-          <w:rFonts w:asciiTheme="majorHAnsi" w:hAnsiTheme="majorHAnsi" w:cstheme="majorHAnsi"/>
-          <w:color w:val="000000" w:themeColor="text1"/>
-        </w:rPr>
-        <w:t>CC_No</w:t>
-      </w:r>
-      <w:proofErr w:type="spellEnd"/>
-      <w:r>
-        <w:rPr>
-          <w:rFonts w:asciiTheme="majorHAnsi" w:hAnsiTheme="majorHAnsi" w:cstheme="majorHAnsi"/>
-          <w:color w:val="000000" w:themeColor="text1"/>
-        </w:rPr>
-        <w:t>. CÉDULA _Nombre del instructor Ejemplo: CC_12345678_ Jaime López</w:t>
+      <w:r>
+        <w:rPr>
+          <w:rFonts w:asciiTheme="majorHAnsi" w:hAnsiTheme="majorHAnsi" w:cstheme="majorHAnsi"/>
+          <w:color w:val="000000" w:themeColor="text1"/>
+        </w:rPr>
+        <w:t>CC_No. CÉDULA _Nombre del instructor Ejemplo: CC_12345678_ Jaime López</w:t>
       </w:r>
     </w:p>
     <w:p>
@@ -8823,7 +8647,6 @@
         </w:rPr>
         <w:tab/>
       </w:r>
-      <w:proofErr w:type="spellStart"/>
       <w:r>
         <w:rPr>
           <w:rFonts w:asciiTheme="majorHAnsi" w:hAnsiTheme="majorHAnsi" w:cstheme="majorHAnsi"/>
@@ -8839,7 +8662,6 @@
         </w:rPr>
         <w:t>No.CÉDULA</w:t>
       </w:r>
-      <w:proofErr w:type="spellEnd"/>
       <w:proofErr w:type="gramEnd"/>
       <w:r>
         <w:rPr>
@@ -10685,21 +10507,12 @@
         </w:rPr>
         <w:t xml:space="preserve"> </w:t>
       </w:r>
-      <w:proofErr w:type="spellStart"/>
-      <w:r>
-        <w:rPr>
-          <w:rFonts w:asciiTheme="majorHAnsi" w:hAnsiTheme="majorHAnsi" w:cstheme="majorHAnsi"/>
-          <w:color w:val="000000" w:themeColor="text1"/>
-        </w:rPr>
-        <w:t>CompromISO</w:t>
-      </w:r>
-      <w:proofErr w:type="spellEnd"/>
-      <w:r>
-        <w:rPr>
-          <w:rFonts w:asciiTheme="majorHAnsi" w:hAnsiTheme="majorHAnsi" w:cstheme="majorHAnsi"/>
-          <w:color w:val="000000" w:themeColor="text1"/>
-        </w:rPr>
-        <w:t>.</w:t>
+      <w:r>
+        <w:rPr>
+          <w:rFonts w:asciiTheme="majorHAnsi" w:hAnsiTheme="majorHAnsi" w:cstheme="majorHAnsi"/>
+          <w:color w:val="000000" w:themeColor="text1"/>
+        </w:rPr>
+        <w:t>CompromISO.</w:t>
       </w:r>
     </w:p>
     <w:p>
@@ -10981,23 +10794,13 @@
           <w:color w:val="000000" w:themeColor="text1"/>
         </w:rPr>
       </w:pPr>
-      <w:proofErr w:type="spellStart"/>
       <w:r>
         <w:rPr>
           <w:rFonts w:asciiTheme="majorHAnsi" w:hAnsiTheme="majorHAnsi" w:cstheme="majorHAnsi"/>
           <w:b/>
           <w:color w:val="000000" w:themeColor="text1"/>
         </w:rPr>
-        <w:t>Dannin</w:t>
-      </w:r>
-      <w:proofErr w:type="spellEnd"/>
-      <w:r>
-        <w:rPr>
-          <w:rFonts w:asciiTheme="majorHAnsi" w:hAnsiTheme="majorHAnsi" w:cstheme="majorHAnsi"/>
-          <w:b/>
-          <w:color w:val="000000" w:themeColor="text1"/>
-        </w:rPr>
-        <w:t xml:space="preserve"> Leonardo Gómez Rodríguez</w:t>
+        <w:t>Dannin Leonardo Gómez Rodríguez</w:t>
       </w:r>
     </w:p>
     <w:p>

</xml_diff>

<commit_message>
Diseño de tabla cronograma
</commit_message>
<xml_diff>
--- a/CONVOCATORIA DEVNET.docx
+++ b/CONVOCATORIA DEVNET.docx
@@ -2001,7 +2001,7 @@
     <w:p/>
     <w:tbl>
       <w:tblPr>
-        <w:tblStyle w:val="Tablaconcuadrcula"/>
+        <w:tblStyle w:val="Tablaconcuadrcula4-nfasis5"/>
         <w:tblW w:w="7938" w:type="dxa"/>
         <w:tblLook w:val="04A0" w:firstRow="1" w:lastRow="0" w:firstColumn="1" w:lastColumn="0" w:noHBand="0" w:noVBand="1"/>
       </w:tblPr>
@@ -2011,11 +2011,13 @@
         <w:gridCol w:w="5142"/>
       </w:tblGrid>
       <w:tr>
+        <w:trPr>
+          <w:cnfStyle w:val="100000000000" w:firstRow="1" w:lastRow="0" w:firstColumn="0" w:lastColumn="0" w:oddVBand="0" w:evenVBand="0" w:oddHBand="0" w:evenHBand="0" w:firstRowFirstColumn="0" w:firstRowLastColumn="0" w:lastRowFirstColumn="0" w:lastRowLastColumn="0"/>
+        </w:trPr>
         <w:tc>
           <w:tcPr>
+            <w:cnfStyle w:val="001000000000" w:firstRow="0" w:lastRow="0" w:firstColumn="1" w:lastColumn="0" w:oddVBand="0" w:evenVBand="0" w:oddHBand="0" w:evenHBand="0" w:firstRowFirstColumn="0" w:firstRowLastColumn="0" w:lastRowFirstColumn="0" w:lastRowLastColumn="0"/>
             <w:tcW w:w="1701" w:type="dxa"/>
-            <w:shd w:val="clear" w:color="auto" w:fill="D6E3BC" w:themeFill="accent3" w:themeFillTint="66"/>
-            <w:vAlign w:val="center"/>
           </w:tcPr>
           <w:p>
             <w:pPr>
@@ -2023,14 +2025,13 @@
               <w:jc w:val="center"/>
               <w:rPr>
                 <w:rFonts w:eastAsiaTheme="minorEastAsia"/>
-                <w:b/>
+                <w:b w:val="0"/>
                 <w:color w:val="auto"/>
               </w:rPr>
             </w:pPr>
             <w:r>
               <w:rPr>
                 <w:rFonts w:eastAsiaTheme="minorEastAsia"/>
-                <w:b/>
                 <w:color w:val="auto"/>
               </w:rPr>
               <w:t>Fecha</w:t>
@@ -2040,23 +2041,21 @@
         <w:tc>
           <w:tcPr>
             <w:tcW w:w="1095" w:type="dxa"/>
-            <w:shd w:val="clear" w:color="auto" w:fill="D6E3BC" w:themeFill="accent3" w:themeFillTint="66"/>
-            <w:vAlign w:val="center"/>
           </w:tcPr>
           <w:p>
             <w:pPr>
               <w:pStyle w:val="Default"/>
               <w:jc w:val="center"/>
-              <w:rPr>
-                <w:rFonts w:eastAsiaTheme="minorEastAsia"/>
-                <w:b/>
+              <w:cnfStyle w:val="100000000000" w:firstRow="1" w:lastRow="0" w:firstColumn="0" w:lastColumn="0" w:oddVBand="0" w:evenVBand="0" w:oddHBand="0" w:evenHBand="0" w:firstRowFirstColumn="0" w:firstRowLastColumn="0" w:lastRowFirstColumn="0" w:lastRowLastColumn="0"/>
+              <w:rPr>
+                <w:rFonts w:eastAsiaTheme="minorEastAsia"/>
+                <w:b w:val="0"/>
                 <w:color w:val="auto"/>
               </w:rPr>
             </w:pPr>
             <w:r>
               <w:rPr>
                 <w:rFonts w:eastAsiaTheme="minorEastAsia"/>
-                <w:b/>
                 <w:color w:val="auto"/>
               </w:rPr>
               <w:t>Horario</w:t>
@@ -2066,23 +2065,21 @@
         <w:tc>
           <w:tcPr>
             <w:tcW w:w="5142" w:type="dxa"/>
-            <w:shd w:val="clear" w:color="auto" w:fill="D6E3BC" w:themeFill="accent3" w:themeFillTint="66"/>
-            <w:vAlign w:val="center"/>
           </w:tcPr>
           <w:p>
             <w:pPr>
               <w:pStyle w:val="Default"/>
               <w:jc w:val="center"/>
-              <w:rPr>
-                <w:rFonts w:eastAsiaTheme="minorEastAsia"/>
-                <w:b/>
+              <w:cnfStyle w:val="100000000000" w:firstRow="1" w:lastRow="0" w:firstColumn="0" w:lastColumn="0" w:oddVBand="0" w:evenVBand="0" w:oddHBand="0" w:evenHBand="0" w:firstRowFirstColumn="0" w:firstRowLastColumn="0" w:lastRowFirstColumn="0" w:lastRowLastColumn="0"/>
+              <w:rPr>
+                <w:rFonts w:eastAsiaTheme="minorEastAsia"/>
+                <w:b w:val="0"/>
                 <w:color w:val="auto"/>
               </w:rPr>
             </w:pPr>
             <w:r>
               <w:rPr>
                 <w:rFonts w:eastAsiaTheme="minorEastAsia"/>
-                <w:b/>
                 <w:color w:val="auto"/>
               </w:rPr>
               <w:t>Contenido</w:t>
@@ -2092,13 +2089,13 @@
       </w:tr>
       <w:tr>
         <w:trPr>
-          <w:cantSplit/>
+          <w:cnfStyle w:val="000000100000" w:firstRow="0" w:lastRow="0" w:firstColumn="0" w:lastColumn="0" w:oddVBand="0" w:evenVBand="0" w:oddHBand="1" w:evenHBand="0" w:firstRowFirstColumn="0" w:firstRowLastColumn="0" w:lastRowFirstColumn="0" w:lastRowLastColumn="0"/>
         </w:trPr>
         <w:tc>
           <w:tcPr>
+            <w:cnfStyle w:val="001000000000" w:firstRow="0" w:lastRow="0" w:firstColumn="1" w:lastColumn="0" w:oddVBand="0" w:evenVBand="0" w:oddHBand="0" w:evenHBand="0" w:firstRowFirstColumn="0" w:firstRowLastColumn="0" w:lastRowFirstColumn="0" w:lastRowLastColumn="0"/>
             <w:tcW w:w="1701" w:type="dxa"/>
             <w:vMerge w:val="restart"/>
-            <w:vAlign w:val="center"/>
           </w:tcPr>
           <w:p>
             <w:pPr>
@@ -2106,16 +2103,15 @@
               <w:jc w:val="center"/>
               <w:rPr>
                 <w:rFonts w:eastAsiaTheme="minorEastAsia"/>
-                <w:bCs/>
-                <w:color w:val="000000" w:themeColor="text1"/>
-                <w:sz w:val="18"/>
-                <w:szCs w:val="18"/>
-              </w:rPr>
-            </w:pPr>
-            <w:r>
-              <w:rPr>
-                <w:rFonts w:eastAsiaTheme="minorEastAsia"/>
-                <w:bCs/>
+                <w:bCs w:val="0"/>
+                <w:color w:val="000000" w:themeColor="text1"/>
+                <w:sz w:val="18"/>
+                <w:szCs w:val="18"/>
+              </w:rPr>
+            </w:pPr>
+            <w:r>
+              <w:rPr>
+                <w:rFonts w:eastAsiaTheme="minorEastAsia"/>
                 <w:color w:val="000000" w:themeColor="text1"/>
                 <w:sz w:val="18"/>
                 <w:szCs w:val="18"/>
@@ -2125,7 +2121,6 @@
             <w:r>
               <w:rPr>
                 <w:rFonts w:eastAsiaTheme="minorEastAsia"/>
-                <w:bCs/>
                 <w:color w:val="000000" w:themeColor="text1"/>
                 <w:sz w:val="18"/>
                 <w:szCs w:val="18"/>
@@ -2135,7 +2130,6 @@
             <w:r>
               <w:rPr>
                 <w:rFonts w:eastAsiaTheme="minorEastAsia"/>
-                <w:bCs/>
                 <w:color w:val="000000" w:themeColor="text1"/>
                 <w:sz w:val="18"/>
                 <w:szCs w:val="18"/>
@@ -2145,7 +2139,6 @@
             <w:r>
               <w:rPr>
                 <w:rFonts w:eastAsiaTheme="minorEastAsia"/>
-                <w:bCs/>
                 <w:color w:val="000000" w:themeColor="text1"/>
                 <w:sz w:val="18"/>
                 <w:szCs w:val="18"/>
@@ -2155,7 +2148,6 @@
             <w:r>
               <w:rPr>
                 <w:rFonts w:eastAsiaTheme="minorEastAsia"/>
-                <w:bCs/>
                 <w:color w:val="000000" w:themeColor="text1"/>
                 <w:sz w:val="18"/>
                 <w:szCs w:val="18"/>
@@ -2165,7 +2157,6 @@
             <w:r>
               <w:rPr>
                 <w:rFonts w:eastAsiaTheme="minorEastAsia"/>
-                <w:bCs/>
                 <w:color w:val="000000" w:themeColor="text1"/>
                 <w:sz w:val="18"/>
                 <w:szCs w:val="18"/>
@@ -2175,7 +2166,6 @@
             <w:r>
               <w:rPr>
                 <w:rFonts w:eastAsiaTheme="minorEastAsia"/>
-                <w:bCs/>
                 <w:color w:val="000000" w:themeColor="text1"/>
                 <w:sz w:val="18"/>
                 <w:szCs w:val="18"/>
@@ -2185,7 +2175,6 @@
             <w:r>
               <w:rPr>
                 <w:rFonts w:eastAsiaTheme="minorEastAsia"/>
-                <w:bCs/>
                 <w:color w:val="000000" w:themeColor="text1"/>
                 <w:sz w:val="18"/>
                 <w:szCs w:val="18"/>
@@ -2197,12 +2186,12 @@
         <w:tc>
           <w:tcPr>
             <w:tcW w:w="1095" w:type="dxa"/>
-            <w:vAlign w:val="center"/>
           </w:tcPr>
           <w:p>
             <w:pPr>
               <w:pStyle w:val="Default"/>
               <w:jc w:val="center"/>
+              <w:cnfStyle w:val="000000100000" w:firstRow="0" w:lastRow="0" w:firstColumn="0" w:lastColumn="0" w:oddVBand="0" w:evenVBand="0" w:oddHBand="1" w:evenHBand="0" w:firstRowFirstColumn="0" w:firstRowLastColumn="0" w:lastRowFirstColumn="0" w:lastRowLastColumn="0"/>
               <w:rPr>
                 <w:rFonts w:eastAsiaTheme="minorEastAsia"/>
                 <w:bCs/>
@@ -2256,14 +2245,13 @@
         <w:tc>
           <w:tcPr>
             <w:tcW w:w="5142" w:type="dxa"/>
-            <w:vAlign w:val="center"/>
           </w:tcPr>
           <w:p>
             <w:pPr>
               <w:pStyle w:val="Default"/>
-              <w:spacing w:line="240" w:lineRule="auto"/>
               <w:contextualSpacing/>
               <w:jc w:val="both"/>
+              <w:cnfStyle w:val="000000100000" w:firstRow="0" w:lastRow="0" w:firstColumn="0" w:lastColumn="0" w:oddVBand="0" w:evenVBand="0" w:oddHBand="1" w:evenHBand="0" w:firstRowFirstColumn="0" w:firstRowLastColumn="0" w:lastRowFirstColumn="0" w:lastRowLastColumn="0"/>
               <w:rPr>
                 <w:rFonts w:eastAsiaTheme="minorEastAsia"/>
                 <w:bCs/>
@@ -2290,9 +2278,9 @@
                 <w:ilvl w:val="0"/>
                 <w:numId w:val="11"/>
               </w:numPr>
-              <w:spacing w:line="240" w:lineRule="auto"/>
               <w:contextualSpacing/>
               <w:jc w:val="both"/>
+              <w:cnfStyle w:val="000000100000" w:firstRow="0" w:lastRow="0" w:firstColumn="0" w:lastColumn="0" w:oddVBand="0" w:evenVBand="0" w:oddHBand="1" w:evenHBand="0" w:firstRowFirstColumn="0" w:firstRowLastColumn="0" w:lastRowFirstColumn="0" w:lastRowLastColumn="0"/>
               <w:rPr>
                 <w:rFonts w:eastAsiaTheme="minorEastAsia"/>
                 <w:bCs/>
@@ -2319,9 +2307,9 @@
                 <w:ilvl w:val="0"/>
                 <w:numId w:val="11"/>
               </w:numPr>
-              <w:spacing w:line="240" w:lineRule="auto"/>
               <w:contextualSpacing/>
               <w:jc w:val="both"/>
+              <w:cnfStyle w:val="000000100000" w:firstRow="0" w:lastRow="0" w:firstColumn="0" w:lastColumn="0" w:oddVBand="0" w:evenVBand="0" w:oddHBand="1" w:evenHBand="0" w:firstRowFirstColumn="0" w:firstRowLastColumn="0" w:lastRowFirstColumn="0" w:lastRowLastColumn="0"/>
               <w:rPr>
                 <w:rFonts w:eastAsiaTheme="minorEastAsia"/>
                 <w:bCs/>
@@ -2344,10 +2332,10 @@
           <w:p>
             <w:pPr>
               <w:pStyle w:val="Default"/>
-              <w:spacing w:line="240" w:lineRule="auto"/>
               <w:ind w:left="360"/>
               <w:contextualSpacing/>
               <w:jc w:val="both"/>
+              <w:cnfStyle w:val="000000100000" w:firstRow="0" w:lastRow="0" w:firstColumn="0" w:lastColumn="0" w:oddVBand="0" w:evenVBand="0" w:oddHBand="1" w:evenHBand="0" w:firstRowFirstColumn="0" w:firstRowLastColumn="0" w:lastRowFirstColumn="0" w:lastRowLastColumn="0"/>
               <w:rPr>
                 <w:rFonts w:eastAsiaTheme="minorEastAsia"/>
                 <w:bCs/>
@@ -2362,6 +2350,7 @@
               <w:pStyle w:val="Default"/>
               <w:contextualSpacing/>
               <w:jc w:val="both"/>
+              <w:cnfStyle w:val="000000100000" w:firstRow="0" w:lastRow="0" w:firstColumn="0" w:lastColumn="0" w:oddVBand="0" w:evenVBand="0" w:oddHBand="1" w:evenHBand="0" w:firstRowFirstColumn="0" w:firstRowLastColumn="0" w:lastRowFirstColumn="0" w:lastRowLastColumn="0"/>
               <w:rPr>
                 <w:rFonts w:eastAsiaTheme="minorEastAsia"/>
                 <w:bCs/>
@@ -2406,6 +2395,7 @@
               <w:pStyle w:val="Default"/>
               <w:contextualSpacing/>
               <w:jc w:val="both"/>
+              <w:cnfStyle w:val="000000100000" w:firstRow="0" w:lastRow="0" w:firstColumn="0" w:lastColumn="0" w:oddVBand="0" w:evenVBand="0" w:oddHBand="1" w:evenHBand="0" w:firstRowFirstColumn="0" w:firstRowLastColumn="0" w:lastRowFirstColumn="0" w:lastRowLastColumn="0"/>
               <w:rPr>
                 <w:rFonts w:eastAsiaTheme="minorEastAsia"/>
                 <w:bCs/>
@@ -2428,8 +2418,8 @@
           <w:p>
             <w:pPr>
               <w:pStyle w:val="Default"/>
-              <w:spacing w:line="240" w:lineRule="auto"/>
               <w:jc w:val="both"/>
+              <w:cnfStyle w:val="000000100000" w:firstRow="0" w:lastRow="0" w:firstColumn="0" w:lastColumn="0" w:oddVBand="0" w:evenVBand="0" w:oddHBand="1" w:evenHBand="0" w:firstRowFirstColumn="0" w:firstRowLastColumn="0" w:lastRowFirstColumn="0" w:lastRowLastColumn="0"/>
               <w:rPr>
                 <w:rFonts w:eastAsiaTheme="minorEastAsia"/>
                 <w:bCs/>
@@ -2454,35 +2444,47 @@
           <w:p>
             <w:pPr>
               <w:pStyle w:val="Default"/>
-              <w:spacing w:line="240" w:lineRule="auto"/>
               <w:jc w:val="both"/>
-              <w:rPr>
-                <w:rFonts w:eastAsiaTheme="minorEastAsia"/>
-                <w:bCs/>
-                <w:color w:val="000000" w:themeColor="text1"/>
-                <w:sz w:val="18"/>
-                <w:szCs w:val="18"/>
-              </w:rPr>
-            </w:pPr>
-            <w:r>
-              <w:rPr>
-                <w:rFonts w:eastAsiaTheme="minorEastAsia"/>
-                <w:bCs/>
-                <w:color w:val="000000" w:themeColor="text1"/>
-                <w:sz w:val="18"/>
-                <w:szCs w:val="18"/>
-              </w:rPr>
-              <w:t>1.2.2 Lab - Linux Review</w:t>
-            </w:r>
+              <w:cnfStyle w:val="000000100000" w:firstRow="0" w:lastRow="0" w:firstColumn="0" w:lastColumn="0" w:oddVBand="0" w:evenVBand="0" w:oddHBand="1" w:evenHBand="0" w:firstRowFirstColumn="0" w:firstRowLastColumn="0" w:lastRowFirstColumn="0" w:lastRowLastColumn="0"/>
+              <w:rPr>
+                <w:rFonts w:eastAsiaTheme="minorEastAsia"/>
+                <w:bCs/>
+                <w:color w:val="000000" w:themeColor="text1"/>
+                <w:sz w:val="18"/>
+                <w:szCs w:val="18"/>
+              </w:rPr>
+            </w:pPr>
+            <w:r>
+              <w:rPr>
+                <w:rFonts w:eastAsiaTheme="minorEastAsia"/>
+                <w:bCs/>
+                <w:color w:val="000000" w:themeColor="text1"/>
+                <w:sz w:val="18"/>
+                <w:szCs w:val="18"/>
+              </w:rPr>
+              <w:t xml:space="preserve">1.2.2 Lab - Linux </w:t>
+            </w:r>
+            <w:proofErr w:type="spellStart"/>
+            <w:r>
+              <w:rPr>
+                <w:rFonts w:eastAsiaTheme="minorEastAsia"/>
+                <w:bCs/>
+                <w:color w:val="000000" w:themeColor="text1"/>
+                <w:sz w:val="18"/>
+                <w:szCs w:val="18"/>
+              </w:rPr>
+              <w:t>Review</w:t>
+            </w:r>
+            <w:proofErr w:type="spellEnd"/>
           </w:p>
         </w:tc>
       </w:tr>
       <w:tr>
         <w:tc>
           <w:tcPr>
+            <w:cnfStyle w:val="001000000000" w:firstRow="0" w:lastRow="0" w:firstColumn="1" w:lastColumn="0" w:oddVBand="0" w:evenVBand="0" w:oddHBand="0" w:evenHBand="0" w:firstRowFirstColumn="0" w:firstRowLastColumn="0" w:lastRowFirstColumn="0" w:lastRowLastColumn="0"/>
             <w:tcW w:w="1701" w:type="dxa"/>
             <w:vMerge/>
-            <w:vAlign w:val="center"/>
           </w:tcPr>
           <w:p>
             <w:pPr>
@@ -2490,7 +2492,7 @@
               <w:jc w:val="center"/>
               <w:rPr>
                 <w:rFonts w:eastAsiaTheme="minorEastAsia"/>
-                <w:bCs/>
+                <w:bCs w:val="0"/>
                 <w:color w:val="000000" w:themeColor="text1"/>
                 <w:sz w:val="18"/>
                 <w:szCs w:val="18"/>
@@ -2501,12 +2503,12 @@
         <w:tc>
           <w:tcPr>
             <w:tcW w:w="1095" w:type="dxa"/>
-            <w:vAlign w:val="center"/>
           </w:tcPr>
           <w:p>
             <w:pPr>
               <w:pStyle w:val="Default"/>
               <w:jc w:val="center"/>
+              <w:cnfStyle w:val="000000000000" w:firstRow="0" w:lastRow="0" w:firstColumn="0" w:lastColumn="0" w:oddVBand="0" w:evenVBand="0" w:oddHBand="0" w:evenHBand="0" w:firstRowFirstColumn="0" w:firstRowLastColumn="0" w:lastRowFirstColumn="0" w:lastRowLastColumn="0"/>
               <w:rPr>
                 <w:rFonts w:eastAsiaTheme="minorEastAsia"/>
                 <w:bCs/>
@@ -2590,13 +2592,12 @@
         <w:tc>
           <w:tcPr>
             <w:tcW w:w="5142" w:type="dxa"/>
-            <w:vAlign w:val="center"/>
           </w:tcPr>
           <w:p>
             <w:pPr>
               <w:pStyle w:val="Default"/>
-              <w:spacing w:line="240" w:lineRule="auto"/>
               <w:jc w:val="both"/>
+              <w:cnfStyle w:val="000000000000" w:firstRow="0" w:lastRow="0" w:firstColumn="0" w:lastColumn="0" w:oddVBand="0" w:evenVBand="0" w:oddHBand="0" w:evenHBand="0" w:firstRowFirstColumn="0" w:firstRowLastColumn="0" w:lastRowFirstColumn="0" w:lastRowLastColumn="0"/>
               <w:rPr>
                 <w:rFonts w:eastAsiaTheme="minorEastAsia"/>
                 <w:bCs/>
@@ -2621,8 +2622,8 @@
           <w:p>
             <w:pPr>
               <w:pStyle w:val="Default"/>
-              <w:spacing w:line="240" w:lineRule="auto"/>
               <w:jc w:val="both"/>
+              <w:cnfStyle w:val="000000000000" w:firstRow="0" w:lastRow="0" w:firstColumn="0" w:lastColumn="0" w:oddVBand="0" w:evenVBand="0" w:oddHBand="0" w:evenHBand="0" w:firstRowFirstColumn="0" w:firstRowLastColumn="0" w:lastRowFirstColumn="0" w:lastRowLastColumn="0"/>
               <w:rPr>
                 <w:rFonts w:eastAsiaTheme="minorEastAsia"/>
                 <w:bCs/>
@@ -2642,6 +2643,245 @@
                 <w:lang w:val="en-US"/>
               </w:rPr>
               <w:t>2.2.7 Lab - Explore DevNet Resources</w:t>
+            </w:r>
+          </w:p>
+        </w:tc>
+      </w:tr>
+      <w:tr>
+        <w:trPr>
+          <w:cnfStyle w:val="000000100000" w:firstRow="0" w:lastRow="0" w:firstColumn="0" w:lastColumn="0" w:oddVBand="0" w:evenVBand="0" w:oddHBand="1" w:evenHBand="0" w:firstRowFirstColumn="0" w:firstRowLastColumn="0" w:lastRowFirstColumn="0" w:lastRowLastColumn="0"/>
+        </w:trPr>
+        <w:tc>
+          <w:tcPr>
+            <w:cnfStyle w:val="001000000000" w:firstRow="0" w:lastRow="0" w:firstColumn="1" w:lastColumn="0" w:oddVBand="0" w:evenVBand="0" w:oddHBand="0" w:evenHBand="0" w:firstRowFirstColumn="0" w:firstRowLastColumn="0" w:lastRowFirstColumn="0" w:lastRowLastColumn="0"/>
+            <w:tcW w:w="1701" w:type="dxa"/>
+            <w:vMerge w:val="restart"/>
+          </w:tcPr>
+          <w:p>
+            <w:pPr>
+              <w:pStyle w:val="Default"/>
+              <w:jc w:val="center"/>
+              <w:rPr>
+                <w:rFonts w:eastAsiaTheme="minorEastAsia"/>
+                <w:bCs w:val="0"/>
+                <w:color w:val="000000" w:themeColor="text1"/>
+                <w:sz w:val="18"/>
+                <w:szCs w:val="18"/>
+              </w:rPr>
+            </w:pPr>
+            <w:r>
+              <w:rPr>
+                <w:rFonts w:eastAsiaTheme="minorEastAsia"/>
+                <w:color w:val="000000" w:themeColor="text1"/>
+                <w:sz w:val="18"/>
+                <w:szCs w:val="18"/>
+              </w:rPr>
+              <w:t>Miércoles</w:t>
+            </w:r>
+            <w:r>
+              <w:rPr>
+                <w:rFonts w:eastAsiaTheme="minorEastAsia"/>
+                <w:color w:val="000000" w:themeColor="text1"/>
+                <w:sz w:val="18"/>
+                <w:szCs w:val="18"/>
+              </w:rPr>
+              <w:t xml:space="preserve"> </w:t>
+            </w:r>
+            <w:r>
+              <w:rPr>
+                <w:rFonts w:eastAsiaTheme="minorEastAsia"/>
+                <w:color w:val="000000" w:themeColor="text1"/>
+                <w:sz w:val="18"/>
+                <w:szCs w:val="18"/>
+              </w:rPr>
+              <w:t>19</w:t>
+            </w:r>
+            <w:r>
+              <w:rPr>
+                <w:rFonts w:eastAsiaTheme="minorEastAsia"/>
+                <w:color w:val="000000" w:themeColor="text1"/>
+                <w:sz w:val="18"/>
+                <w:szCs w:val="18"/>
+              </w:rPr>
+              <w:t>/</w:t>
+            </w:r>
+            <w:r>
+              <w:rPr>
+                <w:rFonts w:eastAsiaTheme="minorEastAsia"/>
+                <w:color w:val="000000" w:themeColor="text1"/>
+                <w:sz w:val="18"/>
+                <w:szCs w:val="18"/>
+              </w:rPr>
+              <w:t>11</w:t>
+            </w:r>
+            <w:r>
+              <w:rPr>
+                <w:rFonts w:eastAsiaTheme="minorEastAsia"/>
+                <w:color w:val="000000" w:themeColor="text1"/>
+                <w:sz w:val="18"/>
+                <w:szCs w:val="18"/>
+              </w:rPr>
+              <w:t>/202</w:t>
+            </w:r>
+            <w:r>
+              <w:rPr>
+                <w:rFonts w:eastAsiaTheme="minorEastAsia"/>
+                <w:color w:val="000000" w:themeColor="text1"/>
+                <w:sz w:val="18"/>
+                <w:szCs w:val="18"/>
+              </w:rPr>
+              <w:t>5</w:t>
+            </w:r>
+          </w:p>
+        </w:tc>
+        <w:tc>
+          <w:tcPr>
+            <w:tcW w:w="1095" w:type="dxa"/>
+          </w:tcPr>
+          <w:p>
+            <w:pPr>
+              <w:pStyle w:val="Default"/>
+              <w:jc w:val="center"/>
+              <w:cnfStyle w:val="000000100000" w:firstRow="0" w:lastRow="0" w:firstColumn="0" w:lastColumn="0" w:oddVBand="0" w:evenVBand="0" w:oddHBand="1" w:evenHBand="0" w:firstRowFirstColumn="0" w:firstRowLastColumn="0" w:lastRowFirstColumn="0" w:lastRowLastColumn="0"/>
+              <w:rPr>
+                <w:rFonts w:eastAsiaTheme="minorEastAsia"/>
+                <w:bCs/>
+                <w:color w:val="000000" w:themeColor="text1"/>
+                <w:sz w:val="18"/>
+                <w:szCs w:val="18"/>
+              </w:rPr>
+            </w:pPr>
+            <w:r>
+              <w:rPr>
+                <w:rFonts w:eastAsiaTheme="minorEastAsia"/>
+                <w:bCs/>
+                <w:color w:val="000000" w:themeColor="text1"/>
+                <w:sz w:val="18"/>
+                <w:szCs w:val="18"/>
+              </w:rPr>
+              <w:t xml:space="preserve">8:00 </w:t>
+            </w:r>
+            <w:r>
+              <w:rPr>
+                <w:rFonts w:eastAsiaTheme="minorEastAsia"/>
+                <w:bCs/>
+                <w:color w:val="000000" w:themeColor="text1"/>
+                <w:sz w:val="18"/>
+                <w:szCs w:val="18"/>
+              </w:rPr>
+              <w:t>A.M.</w:t>
+            </w:r>
+            <w:r>
+              <w:rPr>
+                <w:rFonts w:eastAsiaTheme="minorEastAsia"/>
+                <w:bCs/>
+                <w:color w:val="000000" w:themeColor="text1"/>
+                <w:sz w:val="18"/>
+                <w:szCs w:val="18"/>
+              </w:rPr>
+              <w:t xml:space="preserve"> a 1:00 </w:t>
+            </w:r>
+            <w:r>
+              <w:rPr>
+                <w:rFonts w:eastAsiaTheme="minorEastAsia"/>
+                <w:bCs/>
+                <w:color w:val="000000" w:themeColor="text1"/>
+                <w:sz w:val="18"/>
+                <w:szCs w:val="18"/>
+              </w:rPr>
+              <w:t>P.M.</w:t>
+            </w:r>
+          </w:p>
+        </w:tc>
+        <w:tc>
+          <w:tcPr>
+            <w:tcW w:w="5142" w:type="dxa"/>
+          </w:tcPr>
+          <w:p>
+            <w:pPr>
+              <w:pStyle w:val="Default"/>
+              <w:jc w:val="both"/>
+              <w:cnfStyle w:val="000000100000" w:firstRow="0" w:lastRow="0" w:firstColumn="0" w:lastColumn="0" w:oddVBand="0" w:evenVBand="0" w:oddHBand="1" w:evenHBand="0" w:firstRowFirstColumn="0" w:firstRowLastColumn="0" w:lastRowFirstColumn="0" w:lastRowLastColumn="0"/>
+              <w:rPr>
+                <w:rFonts w:eastAsiaTheme="minorEastAsia"/>
+                <w:bCs/>
+                <w:color w:val="000000" w:themeColor="text1"/>
+                <w:sz w:val="18"/>
+                <w:szCs w:val="18"/>
+              </w:rPr>
+            </w:pPr>
+            <w:r>
+              <w:rPr>
+                <w:rFonts w:eastAsiaTheme="minorEastAsia"/>
+                <w:bCs/>
+                <w:color w:val="000000" w:themeColor="text1"/>
+                <w:sz w:val="18"/>
+                <w:szCs w:val="18"/>
+              </w:rPr>
+              <w:t>Módulo 3 Contenido de Desarrollo y Diseño de Software</w:t>
+            </w:r>
+            <w:r>
+              <w:rPr>
+                <w:rFonts w:eastAsiaTheme="minorEastAsia"/>
+                <w:bCs/>
+                <w:color w:val="000000" w:themeColor="text1"/>
+                <w:sz w:val="18"/>
+                <w:szCs w:val="18"/>
+              </w:rPr>
+              <w:t xml:space="preserve"> </w:t>
+            </w:r>
+          </w:p>
+          <w:p>
+            <w:pPr>
+              <w:pStyle w:val="Default"/>
+              <w:jc w:val="both"/>
+              <w:cnfStyle w:val="000000100000" w:firstRow="0" w:lastRow="0" w:firstColumn="0" w:lastColumn="0" w:oddVBand="0" w:evenVBand="0" w:oddHBand="1" w:evenHBand="0" w:firstRowFirstColumn="0" w:firstRowLastColumn="0" w:lastRowFirstColumn="0" w:lastRowLastColumn="0"/>
+              <w:rPr>
+                <w:rFonts w:eastAsiaTheme="minorEastAsia"/>
+                <w:bCs/>
+                <w:color w:val="000000" w:themeColor="text1"/>
+                <w:sz w:val="18"/>
+                <w:szCs w:val="18"/>
+                <w:lang w:val="en-US"/>
+              </w:rPr>
+            </w:pPr>
+            <w:r>
+              <w:rPr>
+                <w:rFonts w:eastAsiaTheme="minorEastAsia"/>
+                <w:bCs/>
+                <w:color w:val="000000" w:themeColor="text1"/>
+                <w:sz w:val="18"/>
+                <w:szCs w:val="18"/>
+                <w:lang w:val="en-US"/>
+              </w:rPr>
+              <w:t xml:space="preserve">3.1.12 Lab - Explore Python Development Tools </w:t>
+            </w:r>
+          </w:p>
+          <w:p>
+            <w:pPr>
+              <w:pStyle w:val="Default"/>
+              <w:contextualSpacing/>
+              <w:jc w:val="both"/>
+              <w:cnfStyle w:val="000000100000" w:firstRow="0" w:lastRow="0" w:firstColumn="0" w:lastColumn="0" w:oddVBand="0" w:evenVBand="0" w:oddHBand="1" w:evenHBand="0" w:firstRowFirstColumn="0" w:firstRowLastColumn="0" w:lastRowFirstColumn="0" w:lastRowLastColumn="0"/>
+              <w:rPr>
+                <w:rFonts w:eastAsiaTheme="minorEastAsia"/>
+                <w:bCs/>
+                <w:color w:val="000000" w:themeColor="text1"/>
+                <w:sz w:val="18"/>
+                <w:szCs w:val="18"/>
+                <w:lang w:val="en-US"/>
+              </w:rPr>
+            </w:pPr>
+            <w:r>
+              <w:rPr>
+                <w:rFonts w:eastAsiaTheme="minorEastAsia"/>
+                <w:bCs/>
+                <w:color w:val="000000" w:themeColor="text1"/>
+                <w:sz w:val="18"/>
+                <w:szCs w:val="18"/>
+                <w:lang w:val="en-US"/>
+              </w:rPr>
+              <w:t>3.3.11 Lab - Software Version Control with Git</w:t>
             </w:r>
           </w:p>
         </w:tc>
@@ -2649,9 +2889,9 @@
       <w:tr>
         <w:tc>
           <w:tcPr>
+            <w:cnfStyle w:val="001000000000" w:firstRow="0" w:lastRow="0" w:firstColumn="1" w:lastColumn="0" w:oddVBand="0" w:evenVBand="0" w:oddHBand="0" w:evenHBand="0" w:firstRowFirstColumn="0" w:firstRowLastColumn="0" w:lastRowFirstColumn="0" w:lastRowLastColumn="0"/>
             <w:tcW w:w="1701" w:type="dxa"/>
-            <w:vMerge w:val="restart"/>
-            <w:vAlign w:val="center"/>
+            <w:vMerge/>
           </w:tcPr>
           <w:p>
             <w:pPr>
@@ -2659,130 +2899,91 @@
               <w:jc w:val="center"/>
               <w:rPr>
                 <w:rFonts w:eastAsiaTheme="minorEastAsia"/>
-                <w:bCs/>
-                <w:color w:val="000000" w:themeColor="text1"/>
-                <w:sz w:val="18"/>
-                <w:szCs w:val="18"/>
-              </w:rPr>
-            </w:pPr>
-            <w:r>
-              <w:rPr>
-                <w:rFonts w:eastAsiaTheme="minorEastAsia"/>
-                <w:bCs/>
-                <w:color w:val="000000" w:themeColor="text1"/>
-                <w:sz w:val="18"/>
-                <w:szCs w:val="18"/>
-              </w:rPr>
-              <w:t>Miércoles</w:t>
-            </w:r>
-            <w:r>
-              <w:rPr>
-                <w:rFonts w:eastAsiaTheme="minorEastAsia"/>
-                <w:bCs/>
-                <w:color w:val="000000" w:themeColor="text1"/>
-                <w:sz w:val="18"/>
-                <w:szCs w:val="18"/>
-              </w:rPr>
-              <w:t xml:space="preserve"> </w:t>
-            </w:r>
-            <w:r>
-              <w:rPr>
-                <w:rFonts w:eastAsiaTheme="minorEastAsia"/>
-                <w:bCs/>
-                <w:color w:val="000000" w:themeColor="text1"/>
-                <w:sz w:val="18"/>
-                <w:szCs w:val="18"/>
-              </w:rPr>
-              <w:t>19</w:t>
-            </w:r>
-            <w:r>
-              <w:rPr>
-                <w:rFonts w:eastAsiaTheme="minorEastAsia"/>
-                <w:bCs/>
-                <w:color w:val="000000" w:themeColor="text1"/>
-                <w:sz w:val="18"/>
-                <w:szCs w:val="18"/>
-              </w:rPr>
-              <w:t>/</w:t>
-            </w:r>
-            <w:r>
-              <w:rPr>
-                <w:rFonts w:eastAsiaTheme="minorEastAsia"/>
-                <w:bCs/>
-                <w:color w:val="000000" w:themeColor="text1"/>
-                <w:sz w:val="18"/>
-                <w:szCs w:val="18"/>
-              </w:rPr>
-              <w:t>11</w:t>
-            </w:r>
-            <w:r>
-              <w:rPr>
-                <w:rFonts w:eastAsiaTheme="minorEastAsia"/>
-                <w:bCs/>
-                <w:color w:val="000000" w:themeColor="text1"/>
-                <w:sz w:val="18"/>
-                <w:szCs w:val="18"/>
-              </w:rPr>
-              <w:t>/202</w:t>
-            </w:r>
-            <w:r>
-              <w:rPr>
-                <w:rFonts w:eastAsiaTheme="minorEastAsia"/>
-                <w:bCs/>
-                <w:color w:val="000000" w:themeColor="text1"/>
-                <w:sz w:val="18"/>
-                <w:szCs w:val="18"/>
-              </w:rPr>
-              <w:t>5</w:t>
-            </w:r>
+                <w:bCs w:val="0"/>
+                <w:color w:val="000000" w:themeColor="text1"/>
+                <w:sz w:val="18"/>
+                <w:szCs w:val="18"/>
+                <w:lang w:val="en-US"/>
+              </w:rPr>
+            </w:pPr>
           </w:p>
         </w:tc>
         <w:tc>
           <w:tcPr>
             <w:tcW w:w="1095" w:type="dxa"/>
-            <w:vAlign w:val="center"/>
           </w:tcPr>
           <w:p>
             <w:pPr>
               <w:pStyle w:val="Default"/>
               <w:jc w:val="center"/>
-              <w:rPr>
-                <w:rFonts w:eastAsiaTheme="minorEastAsia"/>
-                <w:bCs/>
-                <w:color w:val="000000" w:themeColor="text1"/>
-                <w:sz w:val="18"/>
-                <w:szCs w:val="18"/>
-              </w:rPr>
-            </w:pPr>
-            <w:r>
-              <w:rPr>
-                <w:rFonts w:eastAsiaTheme="minorEastAsia"/>
-                <w:bCs/>
-                <w:color w:val="000000" w:themeColor="text1"/>
-                <w:sz w:val="18"/>
-                <w:szCs w:val="18"/>
-              </w:rPr>
-              <w:t xml:space="preserve">8:00 </w:t>
-            </w:r>
-            <w:r>
-              <w:rPr>
-                <w:rFonts w:eastAsiaTheme="minorEastAsia"/>
-                <w:bCs/>
-                <w:color w:val="000000" w:themeColor="text1"/>
-                <w:sz w:val="18"/>
-                <w:szCs w:val="18"/>
-              </w:rPr>
-              <w:t>A.M.</w:t>
-            </w:r>
-            <w:r>
-              <w:rPr>
-                <w:rFonts w:eastAsiaTheme="minorEastAsia"/>
-                <w:bCs/>
-                <w:color w:val="000000" w:themeColor="text1"/>
-                <w:sz w:val="18"/>
-                <w:szCs w:val="18"/>
-              </w:rPr>
-              <w:t xml:space="preserve"> a 1:00 </w:t>
+              <w:cnfStyle w:val="000000000000" w:firstRow="0" w:lastRow="0" w:firstColumn="0" w:lastColumn="0" w:oddVBand="0" w:evenVBand="0" w:oddHBand="0" w:evenHBand="0" w:firstRowFirstColumn="0" w:firstRowLastColumn="0" w:lastRowFirstColumn="0" w:lastRowLastColumn="0"/>
+              <w:rPr>
+                <w:rFonts w:eastAsiaTheme="minorEastAsia"/>
+                <w:bCs/>
+                <w:color w:val="000000" w:themeColor="text1"/>
+                <w:sz w:val="18"/>
+                <w:szCs w:val="18"/>
+              </w:rPr>
+            </w:pPr>
+            <w:r>
+              <w:rPr>
+                <w:rFonts w:eastAsiaTheme="minorEastAsia"/>
+                <w:bCs/>
+                <w:color w:val="000000" w:themeColor="text1"/>
+                <w:sz w:val="18"/>
+                <w:szCs w:val="18"/>
+              </w:rPr>
+              <w:t>2</w:t>
+            </w:r>
+            <w:r>
+              <w:rPr>
+                <w:rFonts w:eastAsiaTheme="minorEastAsia"/>
+                <w:bCs/>
+                <w:color w:val="000000" w:themeColor="text1"/>
+                <w:sz w:val="18"/>
+                <w:szCs w:val="18"/>
+              </w:rPr>
+              <w:t xml:space="preserve">:00 </w:t>
+            </w:r>
+            <w:r>
+              <w:rPr>
+                <w:rFonts w:eastAsiaTheme="minorEastAsia"/>
+                <w:bCs/>
+                <w:color w:val="000000" w:themeColor="text1"/>
+                <w:sz w:val="18"/>
+                <w:szCs w:val="18"/>
+              </w:rPr>
+              <w:t>P.M.</w:t>
+            </w:r>
+            <w:r>
+              <w:rPr>
+                <w:rFonts w:eastAsiaTheme="minorEastAsia"/>
+                <w:bCs/>
+                <w:color w:val="000000" w:themeColor="text1"/>
+                <w:sz w:val="18"/>
+                <w:szCs w:val="18"/>
+              </w:rPr>
+              <w:t xml:space="preserve"> a </w:t>
+            </w:r>
+            <w:r>
+              <w:rPr>
+                <w:rFonts w:eastAsiaTheme="minorEastAsia"/>
+                <w:bCs/>
+                <w:color w:val="000000" w:themeColor="text1"/>
+                <w:sz w:val="18"/>
+                <w:szCs w:val="18"/>
+              </w:rPr>
+              <w:t>5</w:t>
+            </w:r>
+            <w:r>
+              <w:rPr>
+                <w:rFonts w:eastAsiaTheme="minorEastAsia"/>
+                <w:bCs/>
+                <w:color w:val="000000" w:themeColor="text1"/>
+                <w:sz w:val="18"/>
+                <w:szCs w:val="18"/>
+              </w:rPr>
+              <w:t xml:space="preserve">:00 </w:t>
             </w:r>
             <w:r>
               <w:rPr>
@@ -2799,47 +3000,38 @@
         <w:tc>
           <w:tcPr>
             <w:tcW w:w="5142" w:type="dxa"/>
-            <w:vAlign w:val="center"/>
           </w:tcPr>
           <w:p>
             <w:pPr>
               <w:pStyle w:val="Default"/>
-              <w:spacing w:line="240" w:lineRule="auto"/>
               <w:jc w:val="both"/>
-              <w:rPr>
-                <w:rFonts w:eastAsiaTheme="minorEastAsia"/>
-                <w:bCs/>
-                <w:color w:val="000000" w:themeColor="text1"/>
-                <w:sz w:val="18"/>
-                <w:szCs w:val="18"/>
-              </w:rPr>
-            </w:pPr>
-            <w:r>
-              <w:rPr>
-                <w:rFonts w:eastAsiaTheme="minorEastAsia"/>
-                <w:bCs/>
-                <w:color w:val="000000" w:themeColor="text1"/>
-                <w:sz w:val="18"/>
-                <w:szCs w:val="18"/>
-              </w:rPr>
-              <w:t>Módulo 3 Contenido de Desarrollo y Diseño de Software</w:t>
-            </w:r>
-            <w:r>
-              <w:rPr>
-                <w:rFonts w:eastAsiaTheme="minorEastAsia"/>
-                <w:bCs/>
-                <w:color w:val="000000" w:themeColor="text1"/>
-                <w:sz w:val="18"/>
-                <w:szCs w:val="18"/>
-              </w:rPr>
-              <w:t xml:space="preserve"> </w:t>
+              <w:cnfStyle w:val="000000000000" w:firstRow="0" w:lastRow="0" w:firstColumn="0" w:lastColumn="0" w:oddVBand="0" w:evenVBand="0" w:oddHBand="0" w:evenHBand="0" w:firstRowFirstColumn="0" w:firstRowLastColumn="0" w:lastRowFirstColumn="0" w:lastRowLastColumn="0"/>
+              <w:rPr>
+                <w:rFonts w:eastAsiaTheme="minorEastAsia"/>
+                <w:bCs/>
+                <w:color w:val="000000" w:themeColor="text1"/>
+                <w:sz w:val="18"/>
+                <w:szCs w:val="18"/>
+                <w:lang w:val="en-US"/>
+              </w:rPr>
+            </w:pPr>
+            <w:r>
+              <w:rPr>
+                <w:rFonts w:eastAsiaTheme="minorEastAsia"/>
+                <w:bCs/>
+                <w:color w:val="000000" w:themeColor="text1"/>
+                <w:sz w:val="18"/>
+                <w:szCs w:val="18"/>
+                <w:lang w:val="en-US"/>
+              </w:rPr>
+              <w:t>3.4.6 Lab - Explore Python Classes</w:t>
             </w:r>
           </w:p>
           <w:p>
             <w:pPr>
               <w:pStyle w:val="Default"/>
-              <w:spacing w:line="240" w:lineRule="auto"/>
               <w:jc w:val="both"/>
+              <w:cnfStyle w:val="000000000000" w:firstRow="0" w:lastRow="0" w:firstColumn="0" w:lastColumn="0" w:oddVBand="0" w:evenVBand="0" w:oddHBand="0" w:evenHBand="0" w:firstRowFirstColumn="0" w:firstRowLastColumn="0" w:lastRowFirstColumn="0" w:lastRowLastColumn="0"/>
               <w:rPr>
                 <w:rFonts w:eastAsiaTheme="minorEastAsia"/>
                 <w:bCs/>
@@ -2858,15 +3050,15 @@
                 <w:szCs w:val="18"/>
                 <w:lang w:val="en-US"/>
               </w:rPr>
-              <w:t xml:space="preserve">3.1.12 Lab - Explore Python Development Tools </w:t>
+              <w:t>3.5.7 Lab - Create a Python Unit Test</w:t>
             </w:r>
           </w:p>
           <w:p>
             <w:pPr>
               <w:pStyle w:val="Default"/>
-              <w:spacing w:line="240" w:lineRule="auto"/>
               <w:contextualSpacing/>
               <w:jc w:val="both"/>
+              <w:cnfStyle w:val="000000000000" w:firstRow="0" w:lastRow="0" w:firstColumn="0" w:lastColumn="0" w:oddVBand="0" w:evenVBand="0" w:oddHBand="0" w:evenHBand="0" w:firstRowFirstColumn="0" w:firstRowLastColumn="0" w:lastRowFirstColumn="0" w:lastRowLastColumn="0"/>
               <w:rPr>
                 <w:rFonts w:eastAsiaTheme="minorEastAsia"/>
                 <w:bCs/>
@@ -2885,7 +3077,311 @@
                 <w:szCs w:val="18"/>
                 <w:lang w:val="en-US"/>
               </w:rPr>
-              <w:t>3.3.11 Lab - Software Version Control with Git</w:t>
+              <w:t>3.6.6 Lab - Parse Different Data Types with Python</w:t>
+            </w:r>
+          </w:p>
+          <w:p>
+            <w:pPr>
+              <w:pStyle w:val="Default"/>
+              <w:contextualSpacing/>
+              <w:jc w:val="both"/>
+              <w:cnfStyle w:val="000000000000" w:firstRow="0" w:lastRow="0" w:firstColumn="0" w:lastColumn="0" w:oddVBand="0" w:evenVBand="0" w:oddHBand="0" w:evenHBand="0" w:firstRowFirstColumn="0" w:firstRowLastColumn="0" w:lastRowFirstColumn="0" w:lastRowLastColumn="0"/>
+              <w:rPr>
+                <w:rFonts w:eastAsiaTheme="minorEastAsia"/>
+                <w:bCs/>
+                <w:color w:val="000000" w:themeColor="text1"/>
+                <w:sz w:val="18"/>
+                <w:szCs w:val="18"/>
+                <w:lang w:val="en-US"/>
+              </w:rPr>
+            </w:pPr>
+          </w:p>
+          <w:p>
+            <w:pPr>
+              <w:pStyle w:val="Default"/>
+              <w:contextualSpacing/>
+              <w:jc w:val="both"/>
+              <w:cnfStyle w:val="000000000000" w:firstRow="0" w:lastRow="0" w:firstColumn="0" w:lastColumn="0" w:oddVBand="0" w:evenVBand="0" w:oddHBand="0" w:evenHBand="0" w:firstRowFirstColumn="0" w:firstRowLastColumn="0" w:lastRowFirstColumn="0" w:lastRowLastColumn="0"/>
+              <w:rPr>
+                <w:rFonts w:eastAsiaTheme="minorEastAsia"/>
+                <w:bCs/>
+                <w:color w:val="000000" w:themeColor="text1"/>
+                <w:sz w:val="18"/>
+                <w:szCs w:val="18"/>
+                <w:lang w:val="en-US"/>
+              </w:rPr>
+            </w:pPr>
+            <w:r>
+              <w:rPr>
+                <w:rFonts w:eastAsiaTheme="minorEastAsia"/>
+                <w:bCs/>
+                <w:color w:val="000000" w:themeColor="text1"/>
+                <w:sz w:val="18"/>
+                <w:szCs w:val="18"/>
+                <w:lang w:val="en-US"/>
+              </w:rPr>
+              <w:t xml:space="preserve">Examen del </w:t>
+            </w:r>
+            <w:proofErr w:type="spellStart"/>
+            <w:r>
+              <w:rPr>
+                <w:rFonts w:eastAsiaTheme="minorEastAsia"/>
+                <w:bCs/>
+                <w:color w:val="000000" w:themeColor="text1"/>
+                <w:sz w:val="18"/>
+                <w:szCs w:val="18"/>
+                <w:lang w:val="en-US"/>
+              </w:rPr>
+              <w:t>módulo</w:t>
+            </w:r>
+            <w:proofErr w:type="spellEnd"/>
+            <w:r>
+              <w:rPr>
+                <w:rFonts w:eastAsiaTheme="minorEastAsia"/>
+                <w:bCs/>
+                <w:color w:val="000000" w:themeColor="text1"/>
+                <w:sz w:val="18"/>
+                <w:szCs w:val="18"/>
+                <w:lang w:val="en-US"/>
+              </w:rPr>
+              <w:t xml:space="preserve"> 1 y 2</w:t>
+            </w:r>
+          </w:p>
+        </w:tc>
+      </w:tr>
+      <w:tr>
+        <w:trPr>
+          <w:cnfStyle w:val="000000100000" w:firstRow="0" w:lastRow="0" w:firstColumn="0" w:lastColumn="0" w:oddVBand="0" w:evenVBand="0" w:oddHBand="1" w:evenHBand="0" w:firstRowFirstColumn="0" w:firstRowLastColumn="0" w:lastRowFirstColumn="0" w:lastRowLastColumn="0"/>
+        </w:trPr>
+        <w:tc>
+          <w:tcPr>
+            <w:cnfStyle w:val="001000000000" w:firstRow="0" w:lastRow="0" w:firstColumn="1" w:lastColumn="0" w:oddVBand="0" w:evenVBand="0" w:oddHBand="0" w:evenHBand="0" w:firstRowFirstColumn="0" w:firstRowLastColumn="0" w:lastRowFirstColumn="0" w:lastRowLastColumn="0"/>
+            <w:tcW w:w="1701" w:type="dxa"/>
+            <w:vMerge w:val="restart"/>
+          </w:tcPr>
+          <w:p>
+            <w:pPr>
+              <w:pStyle w:val="Default"/>
+              <w:jc w:val="center"/>
+              <w:rPr>
+                <w:rFonts w:eastAsiaTheme="minorEastAsia"/>
+                <w:bCs w:val="0"/>
+                <w:color w:val="000000" w:themeColor="text1"/>
+                <w:sz w:val="18"/>
+                <w:szCs w:val="18"/>
+              </w:rPr>
+            </w:pPr>
+            <w:r>
+              <w:rPr>
+                <w:rFonts w:eastAsiaTheme="minorEastAsia"/>
+                <w:color w:val="000000" w:themeColor="text1"/>
+                <w:sz w:val="18"/>
+                <w:szCs w:val="18"/>
+              </w:rPr>
+              <w:t>Jueves</w:t>
+            </w:r>
+          </w:p>
+          <w:p>
+            <w:pPr>
+              <w:pStyle w:val="Default"/>
+              <w:jc w:val="center"/>
+              <w:rPr>
+                <w:rFonts w:eastAsiaTheme="minorEastAsia"/>
+                <w:bCs w:val="0"/>
+                <w:color w:val="000000" w:themeColor="text1"/>
+                <w:sz w:val="18"/>
+                <w:szCs w:val="18"/>
+              </w:rPr>
+            </w:pPr>
+            <w:r>
+              <w:rPr>
+                <w:rFonts w:eastAsiaTheme="minorEastAsia"/>
+                <w:color w:val="000000" w:themeColor="text1"/>
+                <w:sz w:val="18"/>
+                <w:szCs w:val="18"/>
+              </w:rPr>
+              <w:t xml:space="preserve"> </w:t>
+            </w:r>
+            <w:r>
+              <w:rPr>
+                <w:rFonts w:eastAsiaTheme="minorEastAsia"/>
+                <w:color w:val="000000" w:themeColor="text1"/>
+                <w:sz w:val="18"/>
+                <w:szCs w:val="18"/>
+              </w:rPr>
+              <w:t>20</w:t>
+            </w:r>
+            <w:r>
+              <w:rPr>
+                <w:rFonts w:eastAsiaTheme="minorEastAsia"/>
+                <w:color w:val="000000" w:themeColor="text1"/>
+                <w:sz w:val="18"/>
+                <w:szCs w:val="18"/>
+              </w:rPr>
+              <w:t>/</w:t>
+            </w:r>
+            <w:r>
+              <w:rPr>
+                <w:rFonts w:eastAsiaTheme="minorEastAsia"/>
+                <w:color w:val="000000" w:themeColor="text1"/>
+                <w:sz w:val="18"/>
+                <w:szCs w:val="18"/>
+              </w:rPr>
+              <w:t>11</w:t>
+            </w:r>
+            <w:r>
+              <w:rPr>
+                <w:rFonts w:eastAsiaTheme="minorEastAsia"/>
+                <w:color w:val="000000" w:themeColor="text1"/>
+                <w:sz w:val="18"/>
+                <w:szCs w:val="18"/>
+              </w:rPr>
+              <w:t>/202</w:t>
+            </w:r>
+            <w:r>
+              <w:rPr>
+                <w:rFonts w:eastAsiaTheme="minorEastAsia"/>
+                <w:color w:val="000000" w:themeColor="text1"/>
+                <w:sz w:val="18"/>
+                <w:szCs w:val="18"/>
+              </w:rPr>
+              <w:t>5</w:t>
+            </w:r>
+          </w:p>
+        </w:tc>
+        <w:tc>
+          <w:tcPr>
+            <w:tcW w:w="1095" w:type="dxa"/>
+          </w:tcPr>
+          <w:p>
+            <w:pPr>
+              <w:pStyle w:val="Default"/>
+              <w:jc w:val="center"/>
+              <w:cnfStyle w:val="000000100000" w:firstRow="0" w:lastRow="0" w:firstColumn="0" w:lastColumn="0" w:oddVBand="0" w:evenVBand="0" w:oddHBand="1" w:evenHBand="0" w:firstRowFirstColumn="0" w:firstRowLastColumn="0" w:lastRowFirstColumn="0" w:lastRowLastColumn="0"/>
+              <w:rPr>
+                <w:rFonts w:eastAsiaTheme="minorEastAsia"/>
+                <w:bCs/>
+                <w:color w:val="000000" w:themeColor="text1"/>
+                <w:sz w:val="18"/>
+                <w:szCs w:val="18"/>
+              </w:rPr>
+            </w:pPr>
+            <w:r>
+              <w:rPr>
+                <w:rFonts w:eastAsiaTheme="minorEastAsia"/>
+                <w:bCs/>
+                <w:color w:val="000000" w:themeColor="text1"/>
+                <w:sz w:val="18"/>
+                <w:szCs w:val="18"/>
+              </w:rPr>
+              <w:t xml:space="preserve">8:00 </w:t>
+            </w:r>
+            <w:r>
+              <w:rPr>
+                <w:rFonts w:eastAsiaTheme="minorEastAsia"/>
+                <w:bCs/>
+                <w:color w:val="000000" w:themeColor="text1"/>
+                <w:sz w:val="18"/>
+                <w:szCs w:val="18"/>
+              </w:rPr>
+              <w:t>A.M.</w:t>
+            </w:r>
+            <w:r>
+              <w:rPr>
+                <w:rFonts w:eastAsiaTheme="minorEastAsia"/>
+                <w:bCs/>
+                <w:color w:val="000000" w:themeColor="text1"/>
+                <w:sz w:val="18"/>
+                <w:szCs w:val="18"/>
+              </w:rPr>
+              <w:t xml:space="preserve"> a 1:00 </w:t>
+            </w:r>
+            <w:r>
+              <w:rPr>
+                <w:rFonts w:eastAsiaTheme="minorEastAsia"/>
+                <w:bCs/>
+                <w:color w:val="000000" w:themeColor="text1"/>
+                <w:sz w:val="18"/>
+                <w:szCs w:val="18"/>
+              </w:rPr>
+              <w:t>P.M.</w:t>
+            </w:r>
+          </w:p>
+        </w:tc>
+        <w:tc>
+          <w:tcPr>
+            <w:tcW w:w="5142" w:type="dxa"/>
+          </w:tcPr>
+          <w:p>
+            <w:pPr>
+              <w:pStyle w:val="Default"/>
+              <w:contextualSpacing/>
+              <w:jc w:val="both"/>
+              <w:cnfStyle w:val="000000100000" w:firstRow="0" w:lastRow="0" w:firstColumn="0" w:lastColumn="0" w:oddVBand="0" w:evenVBand="0" w:oddHBand="1" w:evenHBand="0" w:firstRowFirstColumn="0" w:firstRowLastColumn="0" w:lastRowFirstColumn="0" w:lastRowLastColumn="0"/>
+              <w:rPr>
+                <w:rFonts w:eastAsiaTheme="minorEastAsia"/>
+                <w:bCs/>
+                <w:color w:val="000000" w:themeColor="text1"/>
+                <w:sz w:val="18"/>
+                <w:szCs w:val="18"/>
+              </w:rPr>
+            </w:pPr>
+            <w:r>
+              <w:rPr>
+                <w:rFonts w:eastAsiaTheme="minorEastAsia"/>
+                <w:bCs/>
+                <w:color w:val="000000" w:themeColor="text1"/>
+                <w:sz w:val="18"/>
+                <w:szCs w:val="18"/>
+              </w:rPr>
+              <w:t>Módul</w:t>
+            </w:r>
+            <w:r>
+              <w:rPr>
+                <w:rFonts w:eastAsiaTheme="minorEastAsia"/>
+                <w:bCs/>
+                <w:color w:val="000000" w:themeColor="text1"/>
+                <w:sz w:val="18"/>
+                <w:szCs w:val="18"/>
+              </w:rPr>
+              <w:t>o</w:t>
+            </w:r>
+            <w:r>
+              <w:rPr>
+                <w:rFonts w:eastAsiaTheme="minorEastAsia"/>
+                <w:bCs/>
+                <w:color w:val="000000" w:themeColor="text1"/>
+                <w:sz w:val="18"/>
+                <w:szCs w:val="18"/>
+              </w:rPr>
+              <w:t xml:space="preserve"> 4 Conocimiento y Uso de API</w:t>
+            </w:r>
+          </w:p>
+          <w:p>
+            <w:pPr>
+              <w:pStyle w:val="Default"/>
+              <w:contextualSpacing/>
+              <w:jc w:val="both"/>
+              <w:cnfStyle w:val="000000100000" w:firstRow="0" w:lastRow="0" w:firstColumn="0" w:lastColumn="0" w:oddVBand="0" w:evenVBand="0" w:oddHBand="1" w:evenHBand="0" w:firstRowFirstColumn="0" w:firstRowLastColumn="0" w:lastRowFirstColumn="0" w:lastRowLastColumn="0"/>
+              <w:rPr>
+                <w:rFonts w:eastAsiaTheme="minorEastAsia"/>
+                <w:bCs/>
+                <w:color w:val="000000" w:themeColor="text1"/>
+                <w:sz w:val="18"/>
+                <w:szCs w:val="18"/>
+                <w:lang w:val="en-US"/>
+              </w:rPr>
+            </w:pPr>
+            <w:r>
+              <w:rPr>
+                <w:rFonts w:eastAsiaTheme="minorEastAsia"/>
+                <w:bCs/>
+                <w:color w:val="000000" w:themeColor="text1"/>
+                <w:sz w:val="18"/>
+                <w:szCs w:val="18"/>
+                <w:lang w:val="en-US"/>
+              </w:rPr>
+              <w:t>4.5.5 Lab - Explore REST APIs with API Simulator and Postman</w:t>
             </w:r>
           </w:p>
         </w:tc>
@@ -2893,9 +3389,9 @@
       <w:tr>
         <w:tc>
           <w:tcPr>
+            <w:cnfStyle w:val="001000000000" w:firstRow="0" w:lastRow="0" w:firstColumn="1" w:lastColumn="0" w:oddVBand="0" w:evenVBand="0" w:oddHBand="0" w:evenHBand="0" w:firstRowFirstColumn="0" w:firstRowLastColumn="0" w:lastRowFirstColumn="0" w:lastRowLastColumn="0"/>
             <w:tcW w:w="1701" w:type="dxa"/>
             <w:vMerge/>
-            <w:vAlign w:val="center"/>
           </w:tcPr>
           <w:p>
             <w:pPr>
@@ -2903,7 +3399,7 @@
               <w:jc w:val="center"/>
               <w:rPr>
                 <w:rFonts w:eastAsiaTheme="minorEastAsia"/>
-                <w:bCs/>
+                <w:bCs w:val="0"/>
                 <w:color w:val="000000" w:themeColor="text1"/>
                 <w:sz w:val="18"/>
                 <w:szCs w:val="18"/>
@@ -2915,12 +3411,12 @@
         <w:tc>
           <w:tcPr>
             <w:tcW w:w="1095" w:type="dxa"/>
-            <w:vAlign w:val="center"/>
           </w:tcPr>
           <w:p>
             <w:pPr>
               <w:pStyle w:val="Default"/>
               <w:jc w:val="center"/>
+              <w:cnfStyle w:val="000000000000" w:firstRow="0" w:lastRow="0" w:firstColumn="0" w:lastColumn="0" w:oddVBand="0" w:evenVBand="0" w:oddHBand="0" w:evenHBand="0" w:firstRowFirstColumn="0" w:firstRowLastColumn="0" w:lastRowFirstColumn="0" w:lastRowLastColumn="0"/>
               <w:rPr>
                 <w:rFonts w:eastAsiaTheme="minorEastAsia"/>
                 <w:bCs/>
@@ -2997,20 +3493,19 @@
                 <w:sz w:val="18"/>
                 <w:szCs w:val="18"/>
               </w:rPr>
-              <w:t>P.M.</w:t>
+              <w:t>P.M</w:t>
             </w:r>
           </w:p>
         </w:tc>
         <w:tc>
           <w:tcPr>
             <w:tcW w:w="5142" w:type="dxa"/>
-            <w:vAlign w:val="center"/>
           </w:tcPr>
           <w:p>
             <w:pPr>
               <w:pStyle w:val="Default"/>
-              <w:spacing w:line="240" w:lineRule="auto"/>
               <w:jc w:val="both"/>
+              <w:cnfStyle w:val="000000000000" w:firstRow="0" w:lastRow="0" w:firstColumn="0" w:lastColumn="0" w:oddVBand="0" w:evenVBand="0" w:oddHBand="0" w:evenHBand="0" w:firstRowFirstColumn="0" w:firstRowLastColumn="0" w:lastRowFirstColumn="0" w:lastRowLastColumn="0"/>
               <w:rPr>
                 <w:rFonts w:eastAsiaTheme="minorEastAsia"/>
                 <w:bCs/>
@@ -3029,41 +3524,15 @@
                 <w:szCs w:val="18"/>
                 <w:lang w:val="en-US"/>
               </w:rPr>
-              <w:t>3.4.6 Lab - Explore Python Classes</w:t>
+              <w:t>4.9.2 Lab - Integrate a REST API in a Python Application</w:t>
             </w:r>
           </w:p>
           <w:p>
             <w:pPr>
               <w:pStyle w:val="Default"/>
-              <w:spacing w:line="240" w:lineRule="auto"/>
-              <w:jc w:val="both"/>
-              <w:rPr>
-                <w:rFonts w:eastAsiaTheme="minorEastAsia"/>
-                <w:bCs/>
-                <w:color w:val="000000" w:themeColor="text1"/>
-                <w:sz w:val="18"/>
-                <w:szCs w:val="18"/>
-                <w:lang w:val="en-US"/>
-              </w:rPr>
-            </w:pPr>
-            <w:r>
-              <w:rPr>
-                <w:rFonts w:eastAsiaTheme="minorEastAsia"/>
-                <w:bCs/>
-                <w:color w:val="000000" w:themeColor="text1"/>
-                <w:sz w:val="18"/>
-                <w:szCs w:val="18"/>
-                <w:lang w:val="en-US"/>
-              </w:rPr>
-              <w:t>3.5.7 Lab - Create a Python Unit Test</w:t>
-            </w:r>
-          </w:p>
-          <w:p>
-            <w:pPr>
-              <w:pStyle w:val="Default"/>
-              <w:spacing w:line="240" w:lineRule="auto"/>
               <w:contextualSpacing/>
               <w:jc w:val="both"/>
+              <w:cnfStyle w:val="000000000000" w:firstRow="0" w:lastRow="0" w:firstColumn="0" w:lastColumn="0" w:oddVBand="0" w:evenVBand="0" w:oddHBand="0" w:evenHBand="0" w:firstRowFirstColumn="0" w:firstRowLastColumn="0" w:lastRowFirstColumn="0" w:lastRowLastColumn="0"/>
               <w:rPr>
                 <w:rFonts w:eastAsiaTheme="minorEastAsia"/>
                 <w:bCs/>
@@ -3082,15 +3551,10 @@
                 <w:szCs w:val="18"/>
                 <w:lang w:val="en-US"/>
               </w:rPr>
-              <w:t>3.6.6 Lab - Parse Different Data Types with Python</w:t>
-            </w:r>
-          </w:p>
-          <w:p>
-            <w:pPr>
-              <w:pStyle w:val="Default"/>
-              <w:spacing w:line="240" w:lineRule="auto"/>
-              <w:contextualSpacing/>
-              <w:jc w:val="both"/>
+              <w:t xml:space="preserve">Examen del </w:t>
+            </w:r>
+            <w:proofErr w:type="spellStart"/>
+            <w:r>
               <w:rPr>
                 <w:rFonts w:eastAsiaTheme="minorEastAsia"/>
                 <w:bCs/>
@@ -3099,14 +3563,10 @@
                 <w:szCs w:val="18"/>
                 <w:lang w:val="en-US"/>
               </w:rPr>
-            </w:pPr>
-          </w:p>
-          <w:p>
-            <w:pPr>
-              <w:pStyle w:val="Default"/>
-              <w:spacing w:line="240" w:lineRule="auto"/>
-              <w:contextualSpacing/>
-              <w:jc w:val="both"/>
+              <w:t>módulo</w:t>
+            </w:r>
+            <w:proofErr w:type="spellEnd"/>
+            <w:r>
               <w:rPr>
                 <w:rFonts w:eastAsiaTheme="minorEastAsia"/>
                 <w:bCs/>
@@ -3115,38 +3575,19 @@
                 <w:szCs w:val="18"/>
                 <w:lang w:val="en-US"/>
               </w:rPr>
-            </w:pPr>
-            <w:r>
-              <w:rPr>
-                <w:rFonts w:eastAsiaTheme="minorEastAsia"/>
-                <w:bCs/>
-                <w:color w:val="000000" w:themeColor="text1"/>
-                <w:sz w:val="18"/>
-                <w:szCs w:val="18"/>
-                <w:lang w:val="en-US"/>
-              </w:rPr>
-              <w:t xml:space="preserve">Examen del </w:t>
-            </w:r>
-            <w:r>
-              <w:rPr>
-                <w:rFonts w:eastAsiaTheme="minorEastAsia"/>
-                <w:bCs/>
-                <w:color w:val="000000" w:themeColor="text1"/>
-                <w:sz w:val="18"/>
-                <w:szCs w:val="18"/>
-                <w:lang w:val="en-US"/>
-              </w:rPr>
-              <w:t>módulo 1 y 2</w:t>
+              <w:t xml:space="preserve"> 3</w:t>
             </w:r>
           </w:p>
         </w:tc>
       </w:tr>
       <w:tr>
+        <w:trPr>
+          <w:cnfStyle w:val="000000100000" w:firstRow="0" w:lastRow="0" w:firstColumn="0" w:lastColumn="0" w:oddVBand="0" w:evenVBand="0" w:oddHBand="1" w:evenHBand="0" w:firstRowFirstColumn="0" w:firstRowLastColumn="0" w:lastRowFirstColumn="0" w:lastRowLastColumn="0"/>
+        </w:trPr>
         <w:tc>
           <w:tcPr>
+            <w:cnfStyle w:val="001000000000" w:firstRow="0" w:lastRow="0" w:firstColumn="1" w:lastColumn="0" w:oddVBand="0" w:evenVBand="0" w:oddHBand="0" w:evenHBand="0" w:firstRowFirstColumn="0" w:firstRowLastColumn="0" w:lastRowFirstColumn="0" w:lastRowLastColumn="0"/>
             <w:tcW w:w="1701" w:type="dxa"/>
-            <w:vMerge w:val="restart"/>
-            <w:vAlign w:val="center"/>
           </w:tcPr>
           <w:p>
             <w:pPr>
@@ -3154,21 +3595,20 @@
               <w:jc w:val="center"/>
               <w:rPr>
                 <w:rFonts w:eastAsiaTheme="minorEastAsia"/>
-                <w:bCs/>
-                <w:color w:val="000000" w:themeColor="text1"/>
-                <w:sz w:val="18"/>
-                <w:szCs w:val="18"/>
-              </w:rPr>
-            </w:pPr>
-            <w:r>
-              <w:rPr>
-                <w:rFonts w:eastAsiaTheme="minorEastAsia"/>
-                <w:bCs/>
-                <w:color w:val="000000" w:themeColor="text1"/>
-                <w:sz w:val="18"/>
-                <w:szCs w:val="18"/>
-              </w:rPr>
-              <w:t>Jueves</w:t>
+                <w:bCs w:val="0"/>
+                <w:color w:val="000000" w:themeColor="text1"/>
+                <w:sz w:val="18"/>
+                <w:szCs w:val="18"/>
+              </w:rPr>
+            </w:pPr>
+            <w:r>
+              <w:rPr>
+                <w:rFonts w:eastAsiaTheme="minorEastAsia"/>
+                <w:color w:val="000000" w:themeColor="text1"/>
+                <w:sz w:val="18"/>
+                <w:szCs w:val="18"/>
+              </w:rPr>
+              <w:t>Viernes</w:t>
             </w:r>
           </w:p>
           <w:p>
@@ -3177,37 +3617,33 @@
               <w:jc w:val="center"/>
               <w:rPr>
                 <w:rFonts w:eastAsiaTheme="minorEastAsia"/>
-                <w:bCs/>
-                <w:color w:val="000000" w:themeColor="text1"/>
-                <w:sz w:val="18"/>
-                <w:szCs w:val="18"/>
-              </w:rPr>
-            </w:pPr>
-            <w:r>
-              <w:rPr>
-                <w:rFonts w:eastAsiaTheme="minorEastAsia"/>
-                <w:bCs/>
-                <w:color w:val="000000" w:themeColor="text1"/>
-                <w:sz w:val="18"/>
-                <w:szCs w:val="18"/>
-              </w:rPr>
-              <w:lastRenderedPageBreak/>
+                <w:bCs w:val="0"/>
+                <w:color w:val="000000" w:themeColor="text1"/>
+                <w:sz w:val="18"/>
+                <w:szCs w:val="18"/>
+              </w:rPr>
+            </w:pPr>
+            <w:r>
+              <w:rPr>
+                <w:rFonts w:eastAsiaTheme="minorEastAsia"/>
+                <w:color w:val="000000" w:themeColor="text1"/>
+                <w:sz w:val="18"/>
+                <w:szCs w:val="18"/>
+              </w:rPr>
               <w:t xml:space="preserve"> </w:t>
             </w:r>
             <w:r>
               <w:rPr>
                 <w:rFonts w:eastAsiaTheme="minorEastAsia"/>
-                <w:bCs/>
-                <w:color w:val="000000" w:themeColor="text1"/>
-                <w:sz w:val="18"/>
-                <w:szCs w:val="18"/>
-              </w:rPr>
-              <w:t>20</w:t>
-            </w:r>
-            <w:r>
-              <w:rPr>
-                <w:rFonts w:eastAsiaTheme="minorEastAsia"/>
-                <w:bCs/>
+                <w:color w:val="000000" w:themeColor="text1"/>
+                <w:sz w:val="18"/>
+                <w:szCs w:val="18"/>
+              </w:rPr>
+              <w:t>21</w:t>
+            </w:r>
+            <w:r>
+              <w:rPr>
+                <w:rFonts w:eastAsiaTheme="minorEastAsia"/>
                 <w:color w:val="000000" w:themeColor="text1"/>
                 <w:sz w:val="18"/>
                 <w:szCs w:val="18"/>
@@ -3217,7 +3653,6 @@
             <w:r>
               <w:rPr>
                 <w:rFonts w:eastAsiaTheme="minorEastAsia"/>
-                <w:bCs/>
                 <w:color w:val="000000" w:themeColor="text1"/>
                 <w:sz w:val="18"/>
                 <w:szCs w:val="18"/>
@@ -3227,7 +3662,6 @@
             <w:r>
               <w:rPr>
                 <w:rFonts w:eastAsiaTheme="minorEastAsia"/>
-                <w:bCs/>
                 <w:color w:val="000000" w:themeColor="text1"/>
                 <w:sz w:val="18"/>
                 <w:szCs w:val="18"/>
@@ -3237,7 +3671,6 @@
             <w:r>
               <w:rPr>
                 <w:rFonts w:eastAsiaTheme="minorEastAsia"/>
-                <w:bCs/>
                 <w:color w:val="000000" w:themeColor="text1"/>
                 <w:sz w:val="18"/>
                 <w:szCs w:val="18"/>
@@ -3249,29 +3682,28 @@
         <w:tc>
           <w:tcPr>
             <w:tcW w:w="1095" w:type="dxa"/>
-            <w:vAlign w:val="center"/>
           </w:tcPr>
           <w:p>
             <w:pPr>
               <w:pStyle w:val="Default"/>
               <w:jc w:val="center"/>
-              <w:rPr>
-                <w:rFonts w:eastAsiaTheme="minorEastAsia"/>
-                <w:bCs/>
-                <w:color w:val="000000" w:themeColor="text1"/>
-                <w:sz w:val="18"/>
-                <w:szCs w:val="18"/>
-              </w:rPr>
-            </w:pPr>
-            <w:r>
-              <w:rPr>
-                <w:rFonts w:eastAsiaTheme="minorEastAsia"/>
-                <w:bCs/>
-                <w:color w:val="000000" w:themeColor="text1"/>
-                <w:sz w:val="18"/>
-                <w:szCs w:val="18"/>
-              </w:rPr>
-              <w:lastRenderedPageBreak/>
+              <w:cnfStyle w:val="000000100000" w:firstRow="0" w:lastRow="0" w:firstColumn="0" w:lastColumn="0" w:oddVBand="0" w:evenVBand="0" w:oddHBand="1" w:evenHBand="0" w:firstRowFirstColumn="0" w:firstRowLastColumn="0" w:lastRowFirstColumn="0" w:lastRowLastColumn="0"/>
+              <w:rPr>
+                <w:rFonts w:eastAsiaTheme="minorEastAsia"/>
+                <w:bCs/>
+                <w:color w:val="000000" w:themeColor="text1"/>
+                <w:sz w:val="18"/>
+                <w:szCs w:val="18"/>
+              </w:rPr>
+            </w:pPr>
+            <w:r>
+              <w:rPr>
+                <w:rFonts w:eastAsiaTheme="minorEastAsia"/>
+                <w:bCs/>
+                <w:color w:val="000000" w:themeColor="text1"/>
+                <w:sz w:val="18"/>
+                <w:szCs w:val="18"/>
+              </w:rPr>
               <w:t xml:space="preserve">8:00 </w:t>
             </w:r>
             <w:r>
@@ -3309,436 +3741,13 @@
         <w:tc>
           <w:tcPr>
             <w:tcW w:w="5142" w:type="dxa"/>
-            <w:vAlign w:val="center"/>
-          </w:tcPr>
-          <w:p>
-            <w:pPr>
-              <w:pStyle w:val="Default"/>
-              <w:spacing w:line="240" w:lineRule="auto"/>
-              <w:contextualSpacing/>
-              <w:jc w:val="both"/>
-              <w:rPr>
-                <w:rFonts w:eastAsiaTheme="minorEastAsia"/>
-                <w:bCs/>
-                <w:color w:val="000000" w:themeColor="text1"/>
-                <w:sz w:val="18"/>
-                <w:szCs w:val="18"/>
-              </w:rPr>
-            </w:pPr>
-            <w:r>
-              <w:rPr>
-                <w:rFonts w:eastAsiaTheme="minorEastAsia"/>
-                <w:bCs/>
-                <w:color w:val="000000" w:themeColor="text1"/>
-                <w:sz w:val="18"/>
-                <w:szCs w:val="18"/>
-              </w:rPr>
-              <w:t>Módul</w:t>
-            </w:r>
-            <w:r>
-              <w:rPr>
-                <w:rFonts w:eastAsiaTheme="minorEastAsia"/>
-                <w:bCs/>
-                <w:color w:val="000000" w:themeColor="text1"/>
-                <w:sz w:val="18"/>
-                <w:szCs w:val="18"/>
-              </w:rPr>
-              <w:t>o</w:t>
-            </w:r>
-            <w:r>
-              <w:rPr>
-                <w:rFonts w:eastAsiaTheme="minorEastAsia"/>
-                <w:bCs/>
-                <w:color w:val="000000" w:themeColor="text1"/>
-                <w:sz w:val="18"/>
-                <w:szCs w:val="18"/>
-              </w:rPr>
-              <w:t xml:space="preserve"> 4 Conocimiento y Uso de API</w:t>
-            </w:r>
-          </w:p>
-          <w:p>
-            <w:pPr>
-              <w:pStyle w:val="Default"/>
-              <w:spacing w:line="240" w:lineRule="auto"/>
-              <w:contextualSpacing/>
-              <w:jc w:val="both"/>
-              <w:rPr>
-                <w:rFonts w:eastAsiaTheme="minorEastAsia"/>
-                <w:bCs/>
-                <w:color w:val="000000" w:themeColor="text1"/>
-                <w:sz w:val="18"/>
-                <w:szCs w:val="18"/>
-                <w:lang w:val="en-US"/>
-              </w:rPr>
-            </w:pPr>
-            <w:r>
-              <w:rPr>
-                <w:rFonts w:eastAsiaTheme="minorEastAsia"/>
-                <w:bCs/>
-                <w:color w:val="000000" w:themeColor="text1"/>
-                <w:sz w:val="18"/>
-                <w:szCs w:val="18"/>
-                <w:lang w:val="en-US"/>
-              </w:rPr>
-              <w:t>4.5.5 Lab - Explore REST APIs with API Simulator and Postman</w:t>
-            </w:r>
-          </w:p>
-        </w:tc>
-      </w:tr>
-      <w:tr>
-        <w:tc>
-          <w:tcPr>
-            <w:tcW w:w="1701" w:type="dxa"/>
-            <w:vMerge/>
-            <w:vAlign w:val="center"/>
-          </w:tcPr>
-          <w:p>
-            <w:pPr>
-              <w:pStyle w:val="Default"/>
-              <w:jc w:val="center"/>
-              <w:rPr>
-                <w:rFonts w:eastAsiaTheme="minorEastAsia"/>
-                <w:bCs/>
-                <w:color w:val="000000" w:themeColor="text1"/>
-                <w:sz w:val="18"/>
-                <w:szCs w:val="18"/>
-                <w:lang w:val="en-US"/>
-              </w:rPr>
-            </w:pPr>
-          </w:p>
-        </w:tc>
-        <w:tc>
-          <w:tcPr>
-            <w:tcW w:w="1095" w:type="dxa"/>
-            <w:vAlign w:val="center"/>
-          </w:tcPr>
-          <w:p>
-            <w:pPr>
-              <w:pStyle w:val="Default"/>
-              <w:jc w:val="center"/>
-              <w:rPr>
-                <w:rFonts w:eastAsiaTheme="minorEastAsia"/>
-                <w:bCs/>
-                <w:color w:val="000000" w:themeColor="text1"/>
-                <w:sz w:val="18"/>
-                <w:szCs w:val="18"/>
-              </w:rPr>
-            </w:pPr>
-            <w:r>
-              <w:rPr>
-                <w:rFonts w:eastAsiaTheme="minorEastAsia"/>
-                <w:bCs/>
-                <w:color w:val="000000" w:themeColor="text1"/>
-                <w:sz w:val="18"/>
-                <w:szCs w:val="18"/>
-              </w:rPr>
-              <w:t>2</w:t>
-            </w:r>
-            <w:r>
-              <w:rPr>
-                <w:rFonts w:eastAsiaTheme="minorEastAsia"/>
-                <w:bCs/>
-                <w:color w:val="000000" w:themeColor="text1"/>
-                <w:sz w:val="18"/>
-                <w:szCs w:val="18"/>
-              </w:rPr>
-              <w:t xml:space="preserve">:00 </w:t>
-            </w:r>
-            <w:r>
-              <w:rPr>
-                <w:rFonts w:eastAsiaTheme="minorEastAsia"/>
-                <w:bCs/>
-                <w:color w:val="000000" w:themeColor="text1"/>
-                <w:sz w:val="18"/>
-                <w:szCs w:val="18"/>
-              </w:rPr>
-              <w:t>P.M.</w:t>
-            </w:r>
-            <w:r>
-              <w:rPr>
-                <w:rFonts w:eastAsiaTheme="minorEastAsia"/>
-                <w:bCs/>
-                <w:color w:val="000000" w:themeColor="text1"/>
-                <w:sz w:val="18"/>
-                <w:szCs w:val="18"/>
-              </w:rPr>
-              <w:t xml:space="preserve"> a </w:t>
-            </w:r>
-            <w:r>
-              <w:rPr>
-                <w:rFonts w:eastAsiaTheme="minorEastAsia"/>
-                <w:bCs/>
-                <w:color w:val="000000" w:themeColor="text1"/>
-                <w:sz w:val="18"/>
-                <w:szCs w:val="18"/>
-              </w:rPr>
-              <w:t>5</w:t>
-            </w:r>
-            <w:r>
-              <w:rPr>
-                <w:rFonts w:eastAsiaTheme="minorEastAsia"/>
-                <w:bCs/>
-                <w:color w:val="000000" w:themeColor="text1"/>
-                <w:sz w:val="18"/>
-                <w:szCs w:val="18"/>
-              </w:rPr>
-              <w:t xml:space="preserve">:00 </w:t>
-            </w:r>
-            <w:r>
-              <w:rPr>
-                <w:rFonts w:eastAsiaTheme="minorEastAsia"/>
-                <w:bCs/>
-                <w:color w:val="000000" w:themeColor="text1"/>
-                <w:sz w:val="18"/>
-                <w:szCs w:val="18"/>
-              </w:rPr>
-              <w:t>P.M</w:t>
-            </w:r>
-          </w:p>
-        </w:tc>
-        <w:tc>
-          <w:tcPr>
-            <w:tcW w:w="5142" w:type="dxa"/>
-            <w:vAlign w:val="center"/>
-          </w:tcPr>
-          <w:p>
-            <w:pPr>
-              <w:pStyle w:val="Default"/>
-              <w:spacing w:line="240" w:lineRule="auto"/>
-              <w:jc w:val="both"/>
-              <w:rPr>
-                <w:rFonts w:eastAsiaTheme="minorEastAsia"/>
-                <w:bCs/>
-                <w:color w:val="000000" w:themeColor="text1"/>
-                <w:sz w:val="18"/>
-                <w:szCs w:val="18"/>
-                <w:lang w:val="en-US"/>
-              </w:rPr>
-            </w:pPr>
-            <w:r>
-              <w:rPr>
-                <w:rFonts w:eastAsiaTheme="minorEastAsia"/>
-                <w:bCs/>
-                <w:color w:val="000000" w:themeColor="text1"/>
-                <w:sz w:val="18"/>
-                <w:szCs w:val="18"/>
-                <w:lang w:val="en-US"/>
-              </w:rPr>
-              <w:t>4.9.2 Lab - Integrate a REST API in a Python Application</w:t>
-            </w:r>
-          </w:p>
-          <w:p>
-            <w:pPr>
-              <w:pStyle w:val="Default"/>
-              <w:spacing w:line="240" w:lineRule="auto"/>
-              <w:contextualSpacing/>
-              <w:jc w:val="both"/>
-              <w:rPr>
-                <w:rFonts w:eastAsiaTheme="minorEastAsia"/>
-                <w:bCs/>
-                <w:color w:val="000000" w:themeColor="text1"/>
-                <w:sz w:val="18"/>
-                <w:szCs w:val="18"/>
-                <w:lang w:val="en-US"/>
-              </w:rPr>
-            </w:pPr>
-            <w:r>
-              <w:rPr>
-                <w:rFonts w:eastAsiaTheme="minorEastAsia"/>
-                <w:bCs/>
-                <w:color w:val="000000" w:themeColor="text1"/>
-                <w:sz w:val="18"/>
-                <w:szCs w:val="18"/>
-                <w:lang w:val="en-US"/>
-              </w:rPr>
-              <w:t xml:space="preserve">Examen del </w:t>
-            </w:r>
-            <w:r>
-              <w:rPr>
-                <w:rFonts w:eastAsiaTheme="minorEastAsia"/>
-                <w:bCs/>
-                <w:color w:val="000000" w:themeColor="text1"/>
-                <w:sz w:val="18"/>
-                <w:szCs w:val="18"/>
-                <w:lang w:val="en-US"/>
-              </w:rPr>
-              <w:t>módulo 3</w:t>
-            </w:r>
-          </w:p>
-        </w:tc>
-      </w:tr>
-      <w:tr>
-        <w:tc>
-          <w:tcPr>
-            <w:tcW w:w="1701" w:type="dxa"/>
-            <w:vAlign w:val="center"/>
-          </w:tcPr>
-          <w:p>
-            <w:pPr>
-              <w:pStyle w:val="Default"/>
-              <w:jc w:val="center"/>
-              <w:rPr>
-                <w:rFonts w:eastAsiaTheme="minorEastAsia"/>
-                <w:bCs/>
-                <w:color w:val="000000" w:themeColor="text1"/>
-                <w:sz w:val="18"/>
-                <w:szCs w:val="18"/>
-              </w:rPr>
-            </w:pPr>
-            <w:r>
-              <w:rPr>
-                <w:rFonts w:eastAsiaTheme="minorEastAsia"/>
-                <w:bCs/>
-                <w:color w:val="000000" w:themeColor="text1"/>
-                <w:sz w:val="18"/>
-                <w:szCs w:val="18"/>
-              </w:rPr>
-              <w:t>Viernes</w:t>
-            </w:r>
-          </w:p>
-          <w:p>
-            <w:pPr>
-              <w:pStyle w:val="Default"/>
-              <w:jc w:val="center"/>
-              <w:rPr>
-                <w:rFonts w:eastAsiaTheme="minorEastAsia"/>
-                <w:bCs/>
-                <w:color w:val="000000" w:themeColor="text1"/>
-                <w:sz w:val="18"/>
-                <w:szCs w:val="18"/>
-              </w:rPr>
-            </w:pPr>
-            <w:r>
-              <w:rPr>
-                <w:rFonts w:eastAsiaTheme="minorEastAsia"/>
-                <w:bCs/>
-                <w:color w:val="000000" w:themeColor="text1"/>
-                <w:sz w:val="18"/>
-                <w:szCs w:val="18"/>
-              </w:rPr>
-              <w:t xml:space="preserve"> </w:t>
-            </w:r>
-            <w:r>
-              <w:rPr>
-                <w:rFonts w:eastAsiaTheme="minorEastAsia"/>
-                <w:bCs/>
-                <w:color w:val="000000" w:themeColor="text1"/>
-                <w:sz w:val="18"/>
-                <w:szCs w:val="18"/>
-              </w:rPr>
-              <w:t>21</w:t>
-            </w:r>
-            <w:r>
-              <w:rPr>
-                <w:rFonts w:eastAsiaTheme="minorEastAsia"/>
-                <w:bCs/>
-                <w:color w:val="000000" w:themeColor="text1"/>
-                <w:sz w:val="18"/>
-                <w:szCs w:val="18"/>
-              </w:rPr>
-              <w:t>/</w:t>
-            </w:r>
-            <w:r>
-              <w:rPr>
-                <w:rFonts w:eastAsiaTheme="minorEastAsia"/>
-                <w:bCs/>
-                <w:color w:val="000000" w:themeColor="text1"/>
-                <w:sz w:val="18"/>
-                <w:szCs w:val="18"/>
-              </w:rPr>
-              <w:t>11</w:t>
-            </w:r>
-            <w:r>
-              <w:rPr>
-                <w:rFonts w:eastAsiaTheme="minorEastAsia"/>
-                <w:bCs/>
-                <w:color w:val="000000" w:themeColor="text1"/>
-                <w:sz w:val="18"/>
-                <w:szCs w:val="18"/>
-              </w:rPr>
-              <w:t>/202</w:t>
-            </w:r>
-            <w:r>
-              <w:rPr>
-                <w:rFonts w:eastAsiaTheme="minorEastAsia"/>
-                <w:bCs/>
-                <w:color w:val="000000" w:themeColor="text1"/>
-                <w:sz w:val="18"/>
-                <w:szCs w:val="18"/>
-              </w:rPr>
-              <w:t>5</w:t>
-            </w:r>
-          </w:p>
-        </w:tc>
-        <w:tc>
-          <w:tcPr>
-            <w:tcW w:w="1095" w:type="dxa"/>
-            <w:vAlign w:val="center"/>
-          </w:tcPr>
-          <w:p>
-            <w:pPr>
-              <w:pStyle w:val="Default"/>
-              <w:jc w:val="center"/>
-              <w:rPr>
-                <w:rFonts w:eastAsiaTheme="minorEastAsia"/>
-                <w:bCs/>
-                <w:color w:val="000000" w:themeColor="text1"/>
-                <w:sz w:val="18"/>
-                <w:szCs w:val="18"/>
-              </w:rPr>
-            </w:pPr>
-            <w:r>
-              <w:rPr>
-                <w:rFonts w:eastAsiaTheme="minorEastAsia"/>
-                <w:bCs/>
-                <w:color w:val="000000" w:themeColor="text1"/>
-                <w:sz w:val="18"/>
-                <w:szCs w:val="18"/>
-              </w:rPr>
-              <w:t xml:space="preserve">8:00 </w:t>
-            </w:r>
-            <w:r>
-              <w:rPr>
-                <w:rFonts w:eastAsiaTheme="minorEastAsia"/>
-                <w:bCs/>
-                <w:color w:val="000000" w:themeColor="text1"/>
-                <w:sz w:val="18"/>
-                <w:szCs w:val="18"/>
-              </w:rPr>
-              <w:t>A.M.</w:t>
-            </w:r>
-            <w:r>
-              <w:rPr>
-                <w:rFonts w:eastAsiaTheme="minorEastAsia"/>
-                <w:bCs/>
-                <w:color w:val="000000" w:themeColor="text1"/>
-                <w:sz w:val="18"/>
-                <w:szCs w:val="18"/>
-              </w:rPr>
-              <w:t xml:space="preserve"> a 1:00 </w:t>
-            </w:r>
-            <w:r>
-              <w:rPr>
-                <w:rFonts w:eastAsiaTheme="minorEastAsia"/>
-                <w:bCs/>
-                <w:color w:val="000000" w:themeColor="text1"/>
-                <w:sz w:val="18"/>
-                <w:szCs w:val="18"/>
-              </w:rPr>
-              <w:t>P.M.</w:t>
-            </w:r>
-          </w:p>
-        </w:tc>
-        <w:tc>
-          <w:tcPr>
-            <w:tcW w:w="5142" w:type="dxa"/>
-            <w:vAlign w:val="center"/>
           </w:tcPr>
           <w:p>
             <w:pPr>
               <w:pStyle w:val="Default"/>
               <w:contextualSpacing/>
               <w:jc w:val="both"/>
+              <w:cnfStyle w:val="000000100000" w:firstRow="0" w:lastRow="0" w:firstColumn="0" w:lastColumn="0" w:oddVBand="0" w:evenVBand="0" w:oddHBand="1" w:evenHBand="0" w:firstRowFirstColumn="0" w:firstRowLastColumn="0" w:lastRowFirstColumn="0" w:lastRowLastColumn="0"/>
               <w:rPr>
                 <w:rFonts w:eastAsiaTheme="minorEastAsia"/>
                 <w:bCs/>
@@ -3796,6 +3805,7 @@
               <w:pStyle w:val="Default"/>
               <w:contextualSpacing/>
               <w:jc w:val="both"/>
+              <w:cnfStyle w:val="000000100000" w:firstRow="0" w:lastRow="0" w:firstColumn="0" w:lastColumn="0" w:oddVBand="0" w:evenVBand="0" w:oddHBand="1" w:evenHBand="0" w:firstRowFirstColumn="0" w:firstRowLastColumn="0" w:lastRowFirstColumn="0" w:lastRowLastColumn="0"/>
               <w:rPr>
                 <w:rFonts w:eastAsiaTheme="minorEastAsia"/>
                 <w:bCs/>
@@ -4054,6 +4064,7 @@
               </w:rPr>
               <w:t xml:space="preserve">Examen del </w:t>
             </w:r>
+            <w:proofErr w:type="spellStart"/>
             <w:r>
               <w:rPr>
                 <w:rFonts w:eastAsiaTheme="minorEastAsia"/>
@@ -4063,7 +4074,19 @@
                 <w:szCs w:val="18"/>
                 <w:lang w:val="en-US"/>
               </w:rPr>
-              <w:t>módulo 4</w:t>
+              <w:t>módulo</w:t>
+            </w:r>
+            <w:proofErr w:type="spellEnd"/>
+            <w:r>
+              <w:rPr>
+                <w:rFonts w:eastAsiaTheme="minorEastAsia"/>
+                <w:bCs/>
+                <w:color w:val="000000" w:themeColor="text1"/>
+                <w:sz w:val="18"/>
+                <w:szCs w:val="18"/>
+                <w:lang w:val="en-US"/>
+              </w:rPr>
+              <w:t xml:space="preserve"> 4</w:t>
             </w:r>
           </w:p>
         </w:tc>
@@ -4645,6 +4668,7 @@
               </w:rPr>
               <w:t xml:space="preserve">Examen del </w:t>
             </w:r>
+            <w:proofErr w:type="spellStart"/>
             <w:r>
               <w:rPr>
                 <w:rFonts w:eastAsiaTheme="minorEastAsia"/>
@@ -4654,7 +4678,19 @@
                 <w:szCs w:val="18"/>
                 <w:lang w:val="en-US"/>
               </w:rPr>
-              <w:t>módulo 5</w:t>
+              <w:t>módulo</w:t>
+            </w:r>
+            <w:proofErr w:type="spellEnd"/>
+            <w:r>
+              <w:rPr>
+                <w:rFonts w:eastAsiaTheme="minorEastAsia"/>
+                <w:bCs/>
+                <w:color w:val="000000" w:themeColor="text1"/>
+                <w:sz w:val="18"/>
+                <w:szCs w:val="18"/>
+                <w:lang w:val="en-US"/>
+              </w:rPr>
+              <w:t xml:space="preserve"> 5</w:t>
             </w:r>
           </w:p>
         </w:tc>
@@ -4852,7 +4888,51 @@
                 <w:sz w:val="18"/>
                 <w:szCs w:val="18"/>
               </w:rPr>
-              <w:t xml:space="preserve">7.0.3 Lab - Install the CSR1000v VM </w:t>
+              <w:t xml:space="preserve">7.0.3 Lab - </w:t>
+            </w:r>
+            <w:proofErr w:type="spellStart"/>
+            <w:r>
+              <w:rPr>
+                <w:rFonts w:eastAsiaTheme="minorEastAsia"/>
+                <w:bCs/>
+                <w:color w:val="000000" w:themeColor="text1"/>
+                <w:sz w:val="18"/>
+                <w:szCs w:val="18"/>
+              </w:rPr>
+              <w:t>Install</w:t>
+            </w:r>
+            <w:proofErr w:type="spellEnd"/>
+            <w:r>
+              <w:rPr>
+                <w:rFonts w:eastAsiaTheme="minorEastAsia"/>
+                <w:bCs/>
+                <w:color w:val="000000" w:themeColor="text1"/>
+                <w:sz w:val="18"/>
+                <w:szCs w:val="18"/>
+              </w:rPr>
+              <w:t xml:space="preserve"> </w:t>
+            </w:r>
+            <w:proofErr w:type="spellStart"/>
+            <w:r>
+              <w:rPr>
+                <w:rFonts w:eastAsiaTheme="minorEastAsia"/>
+                <w:bCs/>
+                <w:color w:val="000000" w:themeColor="text1"/>
+                <w:sz w:val="18"/>
+                <w:szCs w:val="18"/>
+              </w:rPr>
+              <w:t>the</w:t>
+            </w:r>
+            <w:proofErr w:type="spellEnd"/>
+            <w:r>
+              <w:rPr>
+                <w:rFonts w:eastAsiaTheme="minorEastAsia"/>
+                <w:bCs/>
+                <w:color w:val="000000" w:themeColor="text1"/>
+                <w:sz w:val="18"/>
+                <w:szCs w:val="18"/>
+              </w:rPr>
+              <w:t xml:space="preserve"> CSR1000v VM </w:t>
             </w:r>
           </w:p>
           <w:p>
@@ -4933,7 +5013,31 @@
                 <w:szCs w:val="18"/>
                 <w:lang w:val="en-US"/>
               </w:rPr>
-              <w:t>7.6.3 Lab - Automated Testing Using pyATS and Genie</w:t>
+              <w:t xml:space="preserve">7.6.3 Lab - Automated Testing Using </w:t>
+            </w:r>
+            <w:proofErr w:type="spellStart"/>
+            <w:r>
+              <w:rPr>
+                <w:rFonts w:eastAsiaTheme="minorEastAsia"/>
+                <w:bCs/>
+                <w:color w:val="000000" w:themeColor="text1"/>
+                <w:sz w:val="18"/>
+                <w:szCs w:val="18"/>
+                <w:lang w:val="en-US"/>
+              </w:rPr>
+              <w:t>pyATS</w:t>
+            </w:r>
+            <w:proofErr w:type="spellEnd"/>
+            <w:r>
+              <w:rPr>
+                <w:rFonts w:eastAsiaTheme="minorEastAsia"/>
+                <w:bCs/>
+                <w:color w:val="000000" w:themeColor="text1"/>
+                <w:sz w:val="18"/>
+                <w:szCs w:val="18"/>
+                <w:lang w:val="en-US"/>
+              </w:rPr>
+              <w:t xml:space="preserve"> and Genie</w:t>
             </w:r>
           </w:p>
           <w:p>
@@ -4962,6 +5066,7 @@
               </w:rPr>
               <w:t xml:space="preserve">Examen del </w:t>
             </w:r>
+            <w:proofErr w:type="spellStart"/>
             <w:r>
               <w:rPr>
                 <w:rFonts w:eastAsiaTheme="minorEastAsia"/>
@@ -4971,7 +5076,19 @@
                 <w:szCs w:val="18"/>
                 <w:lang w:val="en-US"/>
               </w:rPr>
-              <w:t>módulo 6</w:t>
+              <w:t>módulo</w:t>
+            </w:r>
+            <w:proofErr w:type="spellEnd"/>
+            <w:r>
+              <w:rPr>
+                <w:rFonts w:eastAsiaTheme="minorEastAsia"/>
+                <w:bCs/>
+                <w:color w:val="000000" w:themeColor="text1"/>
+                <w:sz w:val="18"/>
+                <w:szCs w:val="18"/>
+                <w:lang w:val="en-US"/>
+              </w:rPr>
+              <w:t xml:space="preserve"> 6</w:t>
             </w:r>
           </w:p>
         </w:tc>
@@ -5266,6 +5383,7 @@
               </w:rPr>
               <w:t xml:space="preserve">Examen del </w:t>
             </w:r>
+            <w:proofErr w:type="spellStart"/>
             <w:r>
               <w:rPr>
                 <w:rFonts w:eastAsiaTheme="minorEastAsia"/>
@@ -5275,7 +5393,19 @@
                 <w:szCs w:val="18"/>
                 <w:lang w:val="en-US"/>
               </w:rPr>
-              <w:t>módulo 7</w:t>
+              <w:t>módulo</w:t>
+            </w:r>
+            <w:proofErr w:type="spellEnd"/>
+            <w:r>
+              <w:rPr>
+                <w:rFonts w:eastAsiaTheme="minorEastAsia"/>
+                <w:bCs/>
+                <w:color w:val="000000" w:themeColor="text1"/>
+                <w:sz w:val="18"/>
+                <w:szCs w:val="18"/>
+                <w:lang w:val="en-US"/>
+              </w:rPr>
+              <w:t xml:space="preserve"> 7</w:t>
             </w:r>
           </w:p>
         </w:tc>
@@ -5481,8 +5611,42 @@
                 <w:sz w:val="18"/>
                 <w:szCs w:val="18"/>
               </w:rPr>
-              <w:t>8 Desarrollo y Plataformas de CiscoExternal tool</w:t>
-            </w:r>
+              <w:t xml:space="preserve">8 Desarrollo y Plataformas de </w:t>
+            </w:r>
+            <w:proofErr w:type="spellStart"/>
+            <w:r>
+              <w:rPr>
+                <w:rFonts w:eastAsiaTheme="minorEastAsia"/>
+                <w:bCs/>
+                <w:color w:val="000000" w:themeColor="text1"/>
+                <w:sz w:val="18"/>
+                <w:szCs w:val="18"/>
+              </w:rPr>
+              <w:t>CiscoExternal</w:t>
+            </w:r>
+            <w:proofErr w:type="spellEnd"/>
+            <w:r>
+              <w:rPr>
+                <w:rFonts w:eastAsiaTheme="minorEastAsia"/>
+                <w:bCs/>
+                <w:color w:val="000000" w:themeColor="text1"/>
+                <w:sz w:val="18"/>
+                <w:szCs w:val="18"/>
+              </w:rPr>
+              <w:t xml:space="preserve"> </w:t>
+            </w:r>
+            <w:proofErr w:type="spellStart"/>
+            <w:r>
+              <w:rPr>
+                <w:rFonts w:eastAsiaTheme="minorEastAsia"/>
+                <w:bCs/>
+                <w:color w:val="000000" w:themeColor="text1"/>
+                <w:sz w:val="18"/>
+                <w:szCs w:val="18"/>
+              </w:rPr>
+              <w:t>tool</w:t>
+            </w:r>
+            <w:proofErr w:type="spellEnd"/>
           </w:p>
           <w:p>
             <w:pPr>
@@ -5587,6 +5751,7 @@
               </w:rPr>
               <w:t xml:space="preserve">Examen del </w:t>
             </w:r>
+            <w:proofErr w:type="spellStart"/>
             <w:r>
               <w:rPr>
                 <w:rFonts w:eastAsiaTheme="minorEastAsia"/>
@@ -5596,7 +5761,19 @@
                 <w:szCs w:val="18"/>
                 <w:lang w:val="en-US"/>
               </w:rPr>
-              <w:t>módulo 8</w:t>
+              <w:t>módulo</w:t>
+            </w:r>
+            <w:proofErr w:type="spellEnd"/>
+            <w:r>
+              <w:rPr>
+                <w:rFonts w:eastAsiaTheme="minorEastAsia"/>
+                <w:bCs/>
+                <w:color w:val="000000" w:themeColor="text1"/>
+                <w:sz w:val="18"/>
+                <w:szCs w:val="18"/>
+                <w:lang w:val="en-US"/>
+              </w:rPr>
+              <w:t xml:space="preserve"> 8</w:t>
             </w:r>
           </w:p>
         </w:tc>
@@ -6033,7 +6210,21 @@
         <w:rPr>
           <w:bCs/>
         </w:rPr>
-        <w:t xml:space="preserve">y Certificación en plataforma de Cisco Netacad </w:t>
+        <w:t xml:space="preserve">y Certificación en plataforma de Cisco </w:t>
+      </w:r>
+      <w:proofErr w:type="spellStart"/>
+      <w:r>
+        <w:rPr>
+          <w:bCs/>
+        </w:rPr>
+        <w:t>Netacad</w:t>
+      </w:r>
+      <w:proofErr w:type="spellEnd"/>
+      <w:r>
+        <w:rPr>
+          <w:bCs/>
+        </w:rPr>
+        <w:t xml:space="preserve"> </w:t>
       </w:r>
     </w:p>
     <w:p>
@@ -6800,6 +6991,7 @@
                 <w:color w:val="000000" w:themeColor="text1"/>
               </w:rPr>
             </w:pPr>
+            <w:proofErr w:type="spellStart"/>
             <w:r>
               <w:rPr>
                 <w:rFonts w:asciiTheme="majorHAnsi" w:hAnsiTheme="majorHAnsi" w:cstheme="majorHAnsi"/>
@@ -6808,6 +7000,7 @@
               </w:rPr>
               <w:t>Teams</w:t>
             </w:r>
+            <w:proofErr w:type="spellEnd"/>
             <w:r>
               <w:rPr>
                 <w:rFonts w:asciiTheme="majorHAnsi" w:hAnsiTheme="majorHAnsi" w:cstheme="majorHAnsi"/>
@@ -6824,13 +7017,23 @@
               </w:rPr>
               <w:t xml:space="preserve"> </w:t>
             </w:r>
+            <w:proofErr w:type="spellStart"/>
             <w:r>
               <w:rPr>
                 <w:rFonts w:asciiTheme="majorHAnsi" w:hAnsiTheme="majorHAnsi" w:cstheme="majorHAnsi"/>
                 <w:bCs/>
                 <w:color w:val="000000" w:themeColor="text1"/>
               </w:rPr>
-              <w:t xml:space="preserve">Webex </w:t>
+              <w:t>Webex</w:t>
+            </w:r>
+            <w:proofErr w:type="spellEnd"/>
+            <w:r>
+              <w:rPr>
+                <w:rFonts w:asciiTheme="majorHAnsi" w:hAnsiTheme="majorHAnsi" w:cstheme="majorHAnsi"/>
+                <w:bCs/>
+                <w:color w:val="000000" w:themeColor="text1"/>
+              </w:rPr>
+              <w:t xml:space="preserve"> </w:t>
             </w:r>
             <w:r>
               <w:rPr>
@@ -8594,12 +8797,21 @@
         </w:rPr>
         <w:tab/>
       </w:r>
-      <w:r>
-        <w:rPr>
-          <w:rFonts w:asciiTheme="majorHAnsi" w:hAnsiTheme="majorHAnsi" w:cstheme="majorHAnsi"/>
-          <w:color w:val="000000" w:themeColor="text1"/>
-        </w:rPr>
-        <w:t>CC_No. CÉDULA _Nombre del instructor Ejemplo: CC_12345678_ Jaime López</w:t>
+      <w:proofErr w:type="spellStart"/>
+      <w:r>
+        <w:rPr>
+          <w:rFonts w:asciiTheme="majorHAnsi" w:hAnsiTheme="majorHAnsi" w:cstheme="majorHAnsi"/>
+          <w:color w:val="000000" w:themeColor="text1"/>
+        </w:rPr>
+        <w:t>CC_No</w:t>
+      </w:r>
+      <w:proofErr w:type="spellEnd"/>
+      <w:r>
+        <w:rPr>
+          <w:rFonts w:asciiTheme="majorHAnsi" w:hAnsiTheme="majorHAnsi" w:cstheme="majorHAnsi"/>
+          <w:color w:val="000000" w:themeColor="text1"/>
+        </w:rPr>
+        <w:t>. CÉDULA _Nombre del instructor Ejemplo: CC_12345678_ Jaime López</w:t>
       </w:r>
     </w:p>
     <w:p>
@@ -8647,6 +8859,7 @@
         </w:rPr>
         <w:tab/>
       </w:r>
+      <w:proofErr w:type="spellStart"/>
       <w:r>
         <w:rPr>
           <w:rFonts w:asciiTheme="majorHAnsi" w:hAnsiTheme="majorHAnsi" w:cstheme="majorHAnsi"/>
@@ -8662,6 +8875,7 @@
         </w:rPr>
         <w:t>No.CÉDULA</w:t>
       </w:r>
+      <w:proofErr w:type="spellEnd"/>
       <w:proofErr w:type="gramEnd"/>
       <w:r>
         <w:rPr>
@@ -10507,12 +10721,21 @@
         </w:rPr>
         <w:t xml:space="preserve"> </w:t>
       </w:r>
-      <w:r>
-        <w:rPr>
-          <w:rFonts w:asciiTheme="majorHAnsi" w:hAnsiTheme="majorHAnsi" w:cstheme="majorHAnsi"/>
-          <w:color w:val="000000" w:themeColor="text1"/>
-        </w:rPr>
-        <w:t>CompromISO.</w:t>
+      <w:proofErr w:type="spellStart"/>
+      <w:r>
+        <w:rPr>
+          <w:rFonts w:asciiTheme="majorHAnsi" w:hAnsiTheme="majorHAnsi" w:cstheme="majorHAnsi"/>
+          <w:color w:val="000000" w:themeColor="text1"/>
+        </w:rPr>
+        <w:t>CompromISO</w:t>
+      </w:r>
+      <w:proofErr w:type="spellEnd"/>
+      <w:r>
+        <w:rPr>
+          <w:rFonts w:asciiTheme="majorHAnsi" w:hAnsiTheme="majorHAnsi" w:cstheme="majorHAnsi"/>
+          <w:color w:val="000000" w:themeColor="text1"/>
+        </w:rPr>
+        <w:t>.</w:t>
       </w:r>
     </w:p>
     <w:p>
@@ -13122,6 +13345,7 @@
   <w:style w:type="character" w:default="1" w:styleId="Fuentedeprrafopredeter">
     <w:name w:val="Default Paragraph Font"/>
     <w:uiPriority w:val="1"/>
+    <w:semiHidden/>
     <w:unhideWhenUsed/>
   </w:style>
   <w:style w:type="table" w:default="1" w:styleId="Tablanormal">

</xml_diff>